<commit_message>
Changes big ones trust
</commit_message>
<xml_diff>
--- a/Documentation/External Documentation/List to go1st.docx
+++ b/Documentation/External Documentation/List to go1st.docx
@@ -1,6 +1,6 @@
 
 <file path=word/document.xml><?xml version="1.0" encoding="utf-8"?>
-<w:document xmlns:wpc="http://schemas.microsoft.com/office/word/2010/wordprocessingCanvas" xmlns:cx="http://schemas.microsoft.com/office/drawing/2014/chartex" xmlns:cx1="http://schemas.microsoft.com/office/drawing/2015/9/8/chartex" xmlns:cx2="http://schemas.microsoft.com/office/drawing/2015/10/21/chartex" xmlns:cx3="http://schemas.microsoft.com/office/drawing/2016/5/9/chartex" xmlns:cx4="http://schemas.microsoft.com/office/drawing/2016/5/10/chartex" xmlns:cx5="http://schemas.microsoft.com/office/drawing/2016/5/11/chartex" xmlns:cx6="http://schemas.microsoft.com/office/drawing/2016/5/12/chartex" xmlns:cx7="http://schemas.microsoft.com/office/drawing/2016/5/13/chartex" xmlns:cx8="http://schemas.microsoft.com/office/drawing/2016/5/14/chartex" xmlns:mc="http://schemas.openxmlformats.org/markup-compatibility/2006" xmlns:aink="http://schemas.microsoft.com/office/drawing/2016/ink" xmlns:am3d="http://schemas.microsoft.com/office/drawing/2017/model3d" xmlns:o="urn:schemas-microsoft-com:office:office" xmlns:oel="http://schemas.microsoft.com/office/2019/extlst" xmlns:r="http://schemas.openxmlformats.org/officeDocument/2006/relationships" xmlns:m="http://schemas.openxmlformats.org/officeDocument/2006/math" xmlns:v="urn:schemas-microsoft-com:vml" xmlns:wp14="http://schemas.microsoft.com/office/word/2010/wordprocessingDrawing" xmlns:wp="http://schemas.openxmlformats.org/drawingml/2006/wordprocessingDrawing" xmlns:w10="urn:schemas-microsoft-com:office:word" xmlns:w="http://schemas.openxmlformats.org/wordprocessingml/2006/main" xmlns:w14="http://schemas.microsoft.com/office/word/2010/wordml" xmlns:w15="http://schemas.microsoft.com/office/word/2012/wordml" xmlns:w16cex="http://schemas.microsoft.com/office/word/2018/wordml/cex" xmlns:w16cid="http://schemas.microsoft.com/office/word/2016/wordml/cid" xmlns:w16="http://schemas.microsoft.com/office/word/2018/wordml" xmlns:w16du="http://schemas.microsoft.com/office/word/2023/wordml/word16du" xmlns:w16sdtdh="http://schemas.microsoft.com/office/word/2020/wordml/sdtdatahash" xmlns:w16sdtfl="http://schemas.microsoft.com/office/word/2024/wordml/sdtformatlock" xmlns:w16se="http://schemas.microsoft.com/office/word/2015/wordml/symex" xmlns:wpg="http://schemas.microsoft.com/office/word/2010/wordprocessingGroup" xmlns:wpi="http://schemas.microsoft.com/office/word/2010/wordprocessingInk" xmlns:wne="http://schemas.microsoft.com/office/word/2006/wordml" xmlns:wps="http://schemas.microsoft.com/office/word/2010/wordprocessingShape" mc:Ignorable="w14 w15 w16se w16cid w16 w16cex w16sdtdh w16sdtfl w16du wp14">
+<w:document xmlns:wpc="http://schemas.microsoft.com/office/word/2010/wordprocessingCanvas" xmlns:mc="http://schemas.openxmlformats.org/markup-compatibility/2006" xmlns:o="urn:schemas-microsoft-com:office:office" xmlns:r="http://schemas.openxmlformats.org/officeDocument/2006/relationships" xmlns:m="http://schemas.openxmlformats.org/officeDocument/2006/math" xmlns:v="urn:schemas-microsoft-com:vml" xmlns:wp14="http://schemas.microsoft.com/office/word/2010/wordprocessingDrawing" xmlns:wp="http://schemas.openxmlformats.org/drawingml/2006/wordprocessingDrawing" xmlns:w10="urn:schemas-microsoft-com:office:word" xmlns:w="http://schemas.openxmlformats.org/wordprocessingml/2006/main" xmlns:w14="http://schemas.microsoft.com/office/word/2010/wordml" xmlns:w15="http://schemas.microsoft.com/office/word/2012/wordml" xmlns:wpg="http://schemas.microsoft.com/office/word/2010/wordprocessingGroup" xmlns:wpi="http://schemas.microsoft.com/office/word/2010/wordprocessingInk" xmlns:wne="http://schemas.microsoft.com/office/word/2006/wordml" xmlns:wps="http://schemas.microsoft.com/office/word/2010/wordprocessingShape" mc:Ignorable="w14 w15 wp14">
   <w:body>
     <w:p>
       <w:pPr>
@@ -279,7 +279,6 @@
         </w:rPr>
         <w:t xml:space="preserve"> </w:t>
       </w:r>
-      <w:proofErr w:type="spellStart"/>
       <w:r>
         <w:rPr>
           <w:rFonts w:ascii="Times New Roman" w:hAnsi="Times New Roman" w:cs="Times New Roman"/>
@@ -307,7 +306,6 @@
         </w:rPr>
         <w:t>rouk</w:t>
       </w:r>
-      <w:proofErr w:type="spellEnd"/>
     </w:p>
     <w:p>
       <w:pPr>
@@ -511,11 +509,6 @@
             <w:rPr>
               <w:rFonts w:eastAsiaTheme="minorEastAsia"/>
               <w:noProof/>
-              <w:kern w:val="2"/>
-              <w:sz w:val="24"/>
-              <w:szCs w:val="24"/>
-              <w:lang w:val="en-GB" w:eastAsia="en-GB"/>
-              <w14:ligatures w14:val="standardContextual"/>
             </w:rPr>
           </w:pPr>
           <w:r>
@@ -545,7 +538,7 @@
             </w:rPr>
             <w:fldChar w:fldCharType="separate"/>
           </w:r>
-          <w:hyperlink w:anchor="_Toc195383789" w:history="1">
+          <w:hyperlink w:anchor="_Toc197130503" w:history="1">
             <w:r>
               <w:rPr>
                 <w:rStyle w:val="Hyperlink"/>
@@ -573,7 +566,7 @@
                 <w:noProof/>
                 <w:webHidden/>
               </w:rPr>
-              <w:instrText xml:space="preserve"> PAGEREF _Toc195383789 \h </w:instrText>
+              <w:instrText xml:space="preserve"> PAGEREF _Toc197130503 \h </w:instrText>
             </w:r>
             <w:r>
               <w:rPr>
@@ -613,14 +606,9 @@
             <w:rPr>
               <w:rFonts w:eastAsiaTheme="minorEastAsia"/>
               <w:noProof/>
-              <w:kern w:val="2"/>
-              <w:sz w:val="24"/>
-              <w:szCs w:val="24"/>
-              <w:lang w:val="en-GB" w:eastAsia="en-GB"/>
-              <w14:ligatures w14:val="standardContextual"/>
             </w:rPr>
           </w:pPr>
-          <w:hyperlink w:anchor="_Toc195383790" w:history="1">
+          <w:hyperlink w:anchor="_Toc197130504" w:history="1">
             <w:r>
               <w:rPr>
                 <w:rStyle w:val="Hyperlink"/>
@@ -648,7 +636,7 @@
                 <w:noProof/>
                 <w:webHidden/>
               </w:rPr>
-              <w:instrText xml:space="preserve"> PAGEREF _Toc195383790 \h </w:instrText>
+              <w:instrText xml:space="preserve"> PAGEREF _Toc197130504 \h </w:instrText>
             </w:r>
             <w:r>
               <w:rPr>
@@ -688,14 +676,9 @@
             <w:rPr>
               <w:rFonts w:eastAsiaTheme="minorEastAsia"/>
               <w:noProof/>
-              <w:kern w:val="2"/>
-              <w:sz w:val="24"/>
-              <w:szCs w:val="24"/>
-              <w:lang w:val="en-GB" w:eastAsia="en-GB"/>
-              <w14:ligatures w14:val="standardContextual"/>
             </w:rPr>
           </w:pPr>
-          <w:hyperlink w:anchor="_Toc195383791" w:history="1">
+          <w:hyperlink w:anchor="_Toc197130505" w:history="1">
             <w:r>
               <w:rPr>
                 <w:rStyle w:val="Hyperlink"/>
@@ -723,7 +706,7 @@
                 <w:noProof/>
                 <w:webHidden/>
               </w:rPr>
-              <w:instrText xml:space="preserve"> PAGEREF _Toc195383791 \h </w:instrText>
+              <w:instrText xml:space="preserve"> PAGEREF _Toc197130505 \h </w:instrText>
             </w:r>
             <w:r>
               <w:rPr>
@@ -763,14 +746,9 @@
             <w:rPr>
               <w:rFonts w:eastAsiaTheme="minorEastAsia"/>
               <w:noProof/>
-              <w:kern w:val="2"/>
-              <w:sz w:val="24"/>
-              <w:szCs w:val="24"/>
-              <w:lang w:val="en-GB" w:eastAsia="en-GB"/>
-              <w14:ligatures w14:val="standardContextual"/>
             </w:rPr>
           </w:pPr>
-          <w:hyperlink w:anchor="_Toc195383792" w:history="1">
+          <w:hyperlink w:anchor="_Toc197130506" w:history="1">
             <w:r>
               <w:rPr>
                 <w:rStyle w:val="Hyperlink"/>
@@ -798,7 +776,7 @@
                 <w:noProof/>
                 <w:webHidden/>
               </w:rPr>
-              <w:instrText xml:space="preserve"> PAGEREF _Toc195383792 \h </w:instrText>
+              <w:instrText xml:space="preserve"> PAGEREF _Toc197130506 \h </w:instrText>
             </w:r>
             <w:r>
               <w:rPr>
@@ -838,14 +816,9 @@
             <w:rPr>
               <w:rFonts w:eastAsiaTheme="minorEastAsia"/>
               <w:noProof/>
-              <w:kern w:val="2"/>
-              <w:sz w:val="24"/>
-              <w:szCs w:val="24"/>
-              <w:lang w:val="en-GB" w:eastAsia="en-GB"/>
-              <w14:ligatures w14:val="standardContextual"/>
             </w:rPr>
           </w:pPr>
-          <w:hyperlink w:anchor="_Toc195383793" w:history="1">
+          <w:hyperlink w:anchor="_Toc197130507" w:history="1">
             <w:r>
               <w:rPr>
                 <w:rStyle w:val="Hyperlink"/>
@@ -873,7 +846,7 @@
                 <w:noProof/>
                 <w:webHidden/>
               </w:rPr>
-              <w:instrText xml:space="preserve"> PAGEREF _Toc195383793 \h </w:instrText>
+              <w:instrText xml:space="preserve"> PAGEREF _Toc197130507 \h </w:instrText>
             </w:r>
             <w:r>
               <w:rPr>
@@ -913,14 +886,9 @@
             <w:rPr>
               <w:rFonts w:eastAsiaTheme="minorEastAsia"/>
               <w:noProof/>
-              <w:kern w:val="2"/>
-              <w:sz w:val="24"/>
-              <w:szCs w:val="24"/>
-              <w:lang w:val="en-GB" w:eastAsia="en-GB"/>
-              <w14:ligatures w14:val="standardContextual"/>
             </w:rPr>
           </w:pPr>
-          <w:hyperlink w:anchor="_Toc195383794" w:history="1">
+          <w:hyperlink w:anchor="_Toc197130508" w:history="1">
             <w:r>
               <w:rPr>
                 <w:rStyle w:val="Hyperlink"/>
@@ -948,7 +916,7 @@
                 <w:noProof/>
                 <w:webHidden/>
               </w:rPr>
-              <w:instrText xml:space="preserve"> PAGEREF _Toc195383794 \h </w:instrText>
+              <w:instrText xml:space="preserve"> PAGEREF _Toc197130508 \h </w:instrText>
             </w:r>
             <w:r>
               <w:rPr>
@@ -988,14 +956,9 @@
             <w:rPr>
               <w:rFonts w:eastAsiaTheme="minorEastAsia"/>
               <w:noProof/>
-              <w:kern w:val="2"/>
-              <w:sz w:val="24"/>
-              <w:szCs w:val="24"/>
-              <w:lang w:val="en-GB" w:eastAsia="en-GB"/>
-              <w14:ligatures w14:val="standardContextual"/>
             </w:rPr>
           </w:pPr>
-          <w:hyperlink w:anchor="_Toc195383795" w:history="1">
+          <w:hyperlink w:anchor="_Toc197130509" w:history="1">
             <w:r>
               <w:rPr>
                 <w:rStyle w:val="Hyperlink"/>
@@ -1023,7 +986,7 @@
                 <w:noProof/>
                 <w:webHidden/>
               </w:rPr>
-              <w:instrText xml:space="preserve"> PAGEREF _Toc195383795 \h </w:instrText>
+              <w:instrText xml:space="preserve"> PAGEREF _Toc197130509 \h </w:instrText>
             </w:r>
             <w:r>
               <w:rPr>
@@ -1063,14 +1026,9 @@
             <w:rPr>
               <w:rFonts w:eastAsiaTheme="minorEastAsia"/>
               <w:noProof/>
-              <w:kern w:val="2"/>
-              <w:sz w:val="24"/>
-              <w:szCs w:val="24"/>
-              <w:lang w:val="en-GB" w:eastAsia="en-GB"/>
-              <w14:ligatures w14:val="standardContextual"/>
             </w:rPr>
           </w:pPr>
-          <w:hyperlink w:anchor="_Toc195383796" w:history="1">
+          <w:hyperlink w:anchor="_Toc197130510" w:history="1">
             <w:r>
               <w:rPr>
                 <w:rStyle w:val="Hyperlink"/>
@@ -1097,7 +1055,7 @@
                 <w:noProof/>
                 <w:webHidden/>
               </w:rPr>
-              <w:instrText xml:space="preserve"> PAGEREF _Toc195383796 \h </w:instrText>
+              <w:instrText xml:space="preserve"> PAGEREF _Toc197130510 \h </w:instrText>
             </w:r>
             <w:r>
               <w:rPr>
@@ -1137,20 +1095,15 @@
             <w:rPr>
               <w:rFonts w:eastAsiaTheme="minorEastAsia"/>
               <w:noProof/>
-              <w:kern w:val="2"/>
-              <w:sz w:val="24"/>
-              <w:szCs w:val="24"/>
-              <w:lang w:val="en-GB" w:eastAsia="en-GB"/>
-              <w14:ligatures w14:val="standardContextual"/>
             </w:rPr>
           </w:pPr>
-          <w:hyperlink w:anchor="_Toc195383797" w:history="1">
+          <w:hyperlink w:anchor="_Toc197130511" w:history="1">
             <w:r>
               <w:rPr>
                 <w:rStyle w:val="Hyperlink"/>
                 <w:noProof/>
               </w:rPr>
-              <w:t>Product backlog:</w:t>
+              <w:t>Product Backlog:</w:t>
             </w:r>
             <w:r>
               <w:rPr>
@@ -1171,7 +1124,7 @@
                 <w:noProof/>
                 <w:webHidden/>
               </w:rPr>
-              <w:instrText xml:space="preserve"> PAGEREF _Toc195383797 \h </w:instrText>
+              <w:instrText xml:space="preserve"> PAGEREF _Toc197130511 \h </w:instrText>
             </w:r>
             <w:r>
               <w:rPr>
@@ -1192,6 +1145,426 @@
                 <w:webHidden/>
               </w:rPr>
               <w:t>9</w:t>
+            </w:r>
+            <w:r>
+              <w:rPr>
+                <w:noProof/>
+                <w:webHidden/>
+              </w:rPr>
+              <w:fldChar w:fldCharType="end"/>
+            </w:r>
+          </w:hyperlink>
+        </w:p>
+        <w:p>
+          <w:pPr>
+            <w:pStyle w:val="TOC2"/>
+            <w:tabs>
+              <w:tab w:val="right" w:leader="dot" w:pos="9350"/>
+            </w:tabs>
+            <w:rPr>
+              <w:rFonts w:eastAsiaTheme="minorEastAsia"/>
+              <w:noProof/>
+            </w:rPr>
+          </w:pPr>
+          <w:hyperlink w:anchor="_Toc197130512" w:history="1">
+            <w:r>
+              <w:rPr>
+                <w:rStyle w:val="Hyperlink"/>
+                <w:rFonts w:ascii="Times New Roman" w:hAnsi="Times New Roman" w:cs="Times New Roman"/>
+                <w:noProof/>
+              </w:rPr>
+              <w:t>Sprint 1</w:t>
+            </w:r>
+            <w:r>
+              <w:rPr>
+                <w:noProof/>
+                <w:webHidden/>
+              </w:rPr>
+              <w:tab/>
+            </w:r>
+            <w:r>
+              <w:rPr>
+                <w:noProof/>
+                <w:webHidden/>
+              </w:rPr>
+              <w:fldChar w:fldCharType="begin"/>
+            </w:r>
+            <w:r>
+              <w:rPr>
+                <w:noProof/>
+                <w:webHidden/>
+              </w:rPr>
+              <w:instrText xml:space="preserve"> PAGEREF _Toc197130512 \h </w:instrText>
+            </w:r>
+            <w:r>
+              <w:rPr>
+                <w:noProof/>
+                <w:webHidden/>
+              </w:rPr>
+            </w:r>
+            <w:r>
+              <w:rPr>
+                <w:noProof/>
+                <w:webHidden/>
+              </w:rPr>
+              <w:fldChar w:fldCharType="separate"/>
+            </w:r>
+            <w:r>
+              <w:rPr>
+                <w:noProof/>
+                <w:webHidden/>
+              </w:rPr>
+              <w:t>9</w:t>
+            </w:r>
+            <w:r>
+              <w:rPr>
+                <w:noProof/>
+                <w:webHidden/>
+              </w:rPr>
+              <w:fldChar w:fldCharType="end"/>
+            </w:r>
+          </w:hyperlink>
+        </w:p>
+        <w:p>
+          <w:pPr>
+            <w:pStyle w:val="TOC2"/>
+            <w:tabs>
+              <w:tab w:val="right" w:leader="dot" w:pos="9350"/>
+            </w:tabs>
+            <w:rPr>
+              <w:rFonts w:eastAsiaTheme="minorEastAsia"/>
+              <w:noProof/>
+            </w:rPr>
+          </w:pPr>
+          <w:hyperlink w:anchor="_Toc197130513" w:history="1">
+            <w:r>
+              <w:rPr>
+                <w:rStyle w:val="Hyperlink"/>
+                <w:rFonts w:ascii="Times New Roman" w:eastAsia="Times New Roman" w:hAnsi="Times New Roman" w:cs="Times New Roman"/>
+                <w:noProof/>
+              </w:rPr>
+              <w:t>Sprint 2</w:t>
+            </w:r>
+            <w:r>
+              <w:rPr>
+                <w:noProof/>
+                <w:webHidden/>
+              </w:rPr>
+              <w:tab/>
+            </w:r>
+            <w:r>
+              <w:rPr>
+                <w:noProof/>
+                <w:webHidden/>
+              </w:rPr>
+              <w:fldChar w:fldCharType="begin"/>
+            </w:r>
+            <w:r>
+              <w:rPr>
+                <w:noProof/>
+                <w:webHidden/>
+              </w:rPr>
+              <w:instrText xml:space="preserve"> PAGEREF _Toc197130513 \h </w:instrText>
+            </w:r>
+            <w:r>
+              <w:rPr>
+                <w:noProof/>
+                <w:webHidden/>
+              </w:rPr>
+            </w:r>
+            <w:r>
+              <w:rPr>
+                <w:noProof/>
+                <w:webHidden/>
+              </w:rPr>
+              <w:fldChar w:fldCharType="separate"/>
+            </w:r>
+            <w:r>
+              <w:rPr>
+                <w:noProof/>
+                <w:webHidden/>
+              </w:rPr>
+              <w:t>9</w:t>
+            </w:r>
+            <w:r>
+              <w:rPr>
+                <w:noProof/>
+                <w:webHidden/>
+              </w:rPr>
+              <w:fldChar w:fldCharType="end"/>
+            </w:r>
+          </w:hyperlink>
+        </w:p>
+        <w:p>
+          <w:pPr>
+            <w:pStyle w:val="TOC2"/>
+            <w:tabs>
+              <w:tab w:val="right" w:leader="dot" w:pos="9350"/>
+            </w:tabs>
+            <w:rPr>
+              <w:rFonts w:eastAsiaTheme="minorEastAsia"/>
+              <w:noProof/>
+            </w:rPr>
+          </w:pPr>
+          <w:hyperlink w:anchor="_Toc197130514" w:history="1">
+            <w:r>
+              <w:rPr>
+                <w:rStyle w:val="Hyperlink"/>
+                <w:rFonts w:ascii="Times New Roman" w:hAnsi="Times New Roman" w:cs="Times New Roman"/>
+                <w:noProof/>
+              </w:rPr>
+              <w:t>Sprint 3</w:t>
+            </w:r>
+            <w:r>
+              <w:rPr>
+                <w:noProof/>
+                <w:webHidden/>
+              </w:rPr>
+              <w:tab/>
+            </w:r>
+            <w:r>
+              <w:rPr>
+                <w:noProof/>
+                <w:webHidden/>
+              </w:rPr>
+              <w:fldChar w:fldCharType="begin"/>
+            </w:r>
+            <w:r>
+              <w:rPr>
+                <w:noProof/>
+                <w:webHidden/>
+              </w:rPr>
+              <w:instrText xml:space="preserve"> PAGEREF _Toc197130514 \h </w:instrText>
+            </w:r>
+            <w:r>
+              <w:rPr>
+                <w:noProof/>
+                <w:webHidden/>
+              </w:rPr>
+            </w:r>
+            <w:r>
+              <w:rPr>
+                <w:noProof/>
+                <w:webHidden/>
+              </w:rPr>
+              <w:fldChar w:fldCharType="separate"/>
+            </w:r>
+            <w:r>
+              <w:rPr>
+                <w:noProof/>
+                <w:webHidden/>
+              </w:rPr>
+              <w:t>10</w:t>
+            </w:r>
+            <w:r>
+              <w:rPr>
+                <w:noProof/>
+                <w:webHidden/>
+              </w:rPr>
+              <w:fldChar w:fldCharType="end"/>
+            </w:r>
+          </w:hyperlink>
+        </w:p>
+        <w:p>
+          <w:pPr>
+            <w:pStyle w:val="TOC2"/>
+            <w:tabs>
+              <w:tab w:val="right" w:leader="dot" w:pos="9350"/>
+            </w:tabs>
+            <w:rPr>
+              <w:rFonts w:eastAsiaTheme="minorEastAsia"/>
+              <w:noProof/>
+            </w:rPr>
+          </w:pPr>
+          <w:hyperlink w:anchor="_Toc197130515" w:history="1">
+            <w:r>
+              <w:rPr>
+                <w:rStyle w:val="Hyperlink"/>
+                <w:rFonts w:ascii="Times New Roman" w:hAnsi="Times New Roman" w:cs="Times New Roman"/>
+                <w:noProof/>
+              </w:rPr>
+              <w:t>Sprint 4</w:t>
+            </w:r>
+            <w:r>
+              <w:rPr>
+                <w:noProof/>
+                <w:webHidden/>
+              </w:rPr>
+              <w:tab/>
+            </w:r>
+            <w:r>
+              <w:rPr>
+                <w:noProof/>
+                <w:webHidden/>
+              </w:rPr>
+              <w:fldChar w:fldCharType="begin"/>
+            </w:r>
+            <w:r>
+              <w:rPr>
+                <w:noProof/>
+                <w:webHidden/>
+              </w:rPr>
+              <w:instrText xml:space="preserve"> PAGEREF _Toc197130515 \h </w:instrText>
+            </w:r>
+            <w:r>
+              <w:rPr>
+                <w:noProof/>
+                <w:webHidden/>
+              </w:rPr>
+            </w:r>
+            <w:r>
+              <w:rPr>
+                <w:noProof/>
+                <w:webHidden/>
+              </w:rPr>
+              <w:fldChar w:fldCharType="separate"/>
+            </w:r>
+            <w:r>
+              <w:rPr>
+                <w:noProof/>
+                <w:webHidden/>
+              </w:rPr>
+              <w:t>11</w:t>
+            </w:r>
+            <w:r>
+              <w:rPr>
+                <w:noProof/>
+                <w:webHidden/>
+              </w:rPr>
+              <w:fldChar w:fldCharType="end"/>
+            </w:r>
+          </w:hyperlink>
+        </w:p>
+        <w:p>
+          <w:pPr>
+            <w:pStyle w:val="TOC2"/>
+            <w:tabs>
+              <w:tab w:val="right" w:leader="dot" w:pos="9350"/>
+            </w:tabs>
+            <w:rPr>
+              <w:rFonts w:eastAsiaTheme="minorEastAsia"/>
+              <w:noProof/>
+            </w:rPr>
+          </w:pPr>
+          <w:hyperlink w:anchor="_Toc197130516" w:history="1">
+            <w:r>
+              <w:rPr>
+                <w:rStyle w:val="Hyperlink"/>
+                <w:rFonts w:ascii="Times New Roman" w:hAnsi="Times New Roman" w:cs="Times New Roman"/>
+                <w:noProof/>
+              </w:rPr>
+              <w:t>Sprint 5:</w:t>
+            </w:r>
+            <w:r>
+              <w:rPr>
+                <w:noProof/>
+                <w:webHidden/>
+              </w:rPr>
+              <w:tab/>
+            </w:r>
+            <w:r>
+              <w:rPr>
+                <w:noProof/>
+                <w:webHidden/>
+              </w:rPr>
+              <w:fldChar w:fldCharType="begin"/>
+            </w:r>
+            <w:r>
+              <w:rPr>
+                <w:noProof/>
+                <w:webHidden/>
+              </w:rPr>
+              <w:instrText xml:space="preserve"> PAGEREF _Toc197130516 \h </w:instrText>
+            </w:r>
+            <w:r>
+              <w:rPr>
+                <w:noProof/>
+                <w:webHidden/>
+              </w:rPr>
+            </w:r>
+            <w:r>
+              <w:rPr>
+                <w:noProof/>
+                <w:webHidden/>
+              </w:rPr>
+              <w:fldChar w:fldCharType="separate"/>
+            </w:r>
+            <w:r>
+              <w:rPr>
+                <w:noProof/>
+                <w:webHidden/>
+              </w:rPr>
+              <w:t>12</w:t>
+            </w:r>
+            <w:r>
+              <w:rPr>
+                <w:noProof/>
+                <w:webHidden/>
+              </w:rPr>
+              <w:fldChar w:fldCharType="end"/>
+            </w:r>
+          </w:hyperlink>
+        </w:p>
+        <w:p>
+          <w:pPr>
+            <w:pStyle w:val="TOC2"/>
+            <w:tabs>
+              <w:tab w:val="right" w:leader="dot" w:pos="9350"/>
+            </w:tabs>
+            <w:rPr>
+              <w:rFonts w:eastAsiaTheme="minorEastAsia"/>
+              <w:noProof/>
+            </w:rPr>
+          </w:pPr>
+          <w:hyperlink w:anchor="_Toc197130517" w:history="1">
+            <w:r>
+              <w:rPr>
+                <w:rStyle w:val="Hyperlink"/>
+                <w:rFonts w:ascii="Times New Roman" w:hAnsi="Times New Roman" w:cs="Times New Roman"/>
+                <w:noProof/>
+              </w:rPr>
+              <w:t>Sprint 6:</w:t>
+            </w:r>
+            <w:r>
+              <w:rPr>
+                <w:noProof/>
+                <w:webHidden/>
+              </w:rPr>
+              <w:tab/>
+            </w:r>
+            <w:r>
+              <w:rPr>
+                <w:noProof/>
+                <w:webHidden/>
+              </w:rPr>
+              <w:fldChar w:fldCharType="begin"/>
+            </w:r>
+            <w:r>
+              <w:rPr>
+                <w:noProof/>
+                <w:webHidden/>
+              </w:rPr>
+              <w:instrText xml:space="preserve"> PAGEREF _Toc197130517 \h </w:instrText>
+            </w:r>
+            <w:r>
+              <w:rPr>
+                <w:noProof/>
+                <w:webHidden/>
+              </w:rPr>
+            </w:r>
+            <w:r>
+              <w:rPr>
+                <w:noProof/>
+                <w:webHidden/>
+              </w:rPr>
+              <w:fldChar w:fldCharType="separate"/>
+            </w:r>
+            <w:r>
+              <w:rPr>
+                <w:noProof/>
+                <w:webHidden/>
+              </w:rPr>
+              <w:t>12</w:t>
             </w:r>
             <w:r>
               <w:rPr>
@@ -1211,21 +1584,16 @@
             <w:rPr>
               <w:rFonts w:eastAsiaTheme="minorEastAsia"/>
               <w:noProof/>
-              <w:kern w:val="2"/>
-              <w:sz w:val="24"/>
-              <w:szCs w:val="24"/>
-              <w:lang w:val="en-GB" w:eastAsia="en-GB"/>
-              <w14:ligatures w14:val="standardContextual"/>
             </w:rPr>
           </w:pPr>
-          <w:hyperlink w:anchor="_Toc195383798" w:history="1">
+          <w:hyperlink w:anchor="_Toc197130518" w:history="1">
             <w:r>
               <w:rPr>
                 <w:rStyle w:val="Hyperlink"/>
                 <w:rFonts w:ascii="Times New Roman" w:eastAsia="Times New Roman" w:hAnsi="Times New Roman" w:cs="Times New Roman"/>
                 <w:noProof/>
               </w:rPr>
-              <w:t>Diagrams:</w:t>
+              <w:t>Quality assurance:</w:t>
             </w:r>
             <w:r>
               <w:rPr>
@@ -1246,7 +1614,7 @@
                 <w:noProof/>
                 <w:webHidden/>
               </w:rPr>
-              <w:instrText xml:space="preserve"> PAGEREF _Toc195383798 \h </w:instrText>
+              <w:instrText xml:space="preserve"> PAGEREF _Toc197130518 \h </w:instrText>
             </w:r>
             <w:r>
               <w:rPr>
@@ -1266,7 +1634,7 @@
                 <w:noProof/>
                 <w:webHidden/>
               </w:rPr>
-              <w:t>9</w:t>
+              <w:t>12</w:t>
             </w:r>
             <w:r>
               <w:rPr>
@@ -1286,21 +1654,16 @@
             <w:rPr>
               <w:rFonts w:eastAsiaTheme="minorEastAsia"/>
               <w:noProof/>
-              <w:kern w:val="2"/>
-              <w:sz w:val="24"/>
-              <w:szCs w:val="24"/>
-              <w:lang w:val="en-GB" w:eastAsia="en-GB"/>
-              <w14:ligatures w14:val="standardContextual"/>
             </w:rPr>
           </w:pPr>
-          <w:hyperlink w:anchor="_Toc195383799" w:history="1">
+          <w:hyperlink w:anchor="_Toc197130519" w:history="1">
             <w:r>
               <w:rPr>
                 <w:rStyle w:val="Hyperlink"/>
                 <w:rFonts w:ascii="Times New Roman" w:eastAsia="Times New Roman" w:hAnsi="Times New Roman" w:cs="Times New Roman"/>
                 <w:noProof/>
               </w:rPr>
-              <w:t>Manual Testing:</w:t>
+              <w:t>Diagrams:</w:t>
             </w:r>
             <w:r>
               <w:rPr>
@@ -1321,7 +1684,7 @@
                 <w:noProof/>
                 <w:webHidden/>
               </w:rPr>
-              <w:instrText xml:space="preserve"> PAGEREF _Toc195383799 \h </w:instrText>
+              <w:instrText xml:space="preserve"> PAGEREF _Toc197130519 \h </w:instrText>
             </w:r>
             <w:r>
               <w:rPr>
@@ -1341,7 +1704,7 @@
                 <w:noProof/>
                 <w:webHidden/>
               </w:rPr>
-              <w:t>9</w:t>
+              <w:t>13</w:t>
             </w:r>
             <w:r>
               <w:rPr>
@@ -1361,21 +1724,16 @@
             <w:rPr>
               <w:rFonts w:eastAsiaTheme="minorEastAsia"/>
               <w:noProof/>
-              <w:kern w:val="2"/>
-              <w:sz w:val="24"/>
-              <w:szCs w:val="24"/>
-              <w:lang w:val="en-GB" w:eastAsia="en-GB"/>
-              <w14:ligatures w14:val="standardContextual"/>
             </w:rPr>
           </w:pPr>
-          <w:hyperlink w:anchor="_Toc195383800" w:history="1">
+          <w:hyperlink w:anchor="_Toc197130520" w:history="1">
             <w:r>
               <w:rPr>
                 <w:rStyle w:val="Hyperlink"/>
                 <w:rFonts w:ascii="Times New Roman" w:eastAsia="Times New Roman" w:hAnsi="Times New Roman" w:cs="Times New Roman"/>
                 <w:noProof/>
               </w:rPr>
-              <w:t>Automation Testing:</w:t>
+              <w:t>Manual Testing:</w:t>
             </w:r>
             <w:r>
               <w:rPr>
@@ -1396,7 +1754,7 @@
                 <w:noProof/>
                 <w:webHidden/>
               </w:rPr>
-              <w:instrText xml:space="preserve"> PAGEREF _Toc195383800 \h </w:instrText>
+              <w:instrText xml:space="preserve"> PAGEREF _Toc197130520 \h </w:instrText>
             </w:r>
             <w:r>
               <w:rPr>
@@ -1416,7 +1774,214 @@
                 <w:noProof/>
                 <w:webHidden/>
               </w:rPr>
-              <w:t>9</w:t>
+              <w:t>18</w:t>
+            </w:r>
+            <w:r>
+              <w:rPr>
+                <w:noProof/>
+                <w:webHidden/>
+              </w:rPr>
+              <w:fldChar w:fldCharType="end"/>
+            </w:r>
+          </w:hyperlink>
+        </w:p>
+        <w:p>
+          <w:pPr>
+            <w:pStyle w:val="TOC2"/>
+            <w:tabs>
+              <w:tab w:val="right" w:leader="dot" w:pos="9350"/>
+            </w:tabs>
+            <w:rPr>
+              <w:rFonts w:eastAsiaTheme="minorEastAsia"/>
+              <w:noProof/>
+            </w:rPr>
+          </w:pPr>
+          <w:hyperlink w:anchor="_Toc197130521" w:history="1">
+            <w:r>
+              <w:rPr>
+                <w:rStyle w:val="Hyperlink"/>
+                <w:noProof/>
+              </w:rPr>
+              <w:t>Sign up Testing:</w:t>
+            </w:r>
+            <w:r>
+              <w:rPr>
+                <w:noProof/>
+                <w:webHidden/>
+              </w:rPr>
+              <w:tab/>
+            </w:r>
+            <w:r>
+              <w:rPr>
+                <w:noProof/>
+                <w:webHidden/>
+              </w:rPr>
+              <w:fldChar w:fldCharType="begin"/>
+            </w:r>
+            <w:r>
+              <w:rPr>
+                <w:noProof/>
+                <w:webHidden/>
+              </w:rPr>
+              <w:instrText xml:space="preserve"> PAGEREF _Toc197130521 \h </w:instrText>
+            </w:r>
+            <w:r>
+              <w:rPr>
+                <w:noProof/>
+                <w:webHidden/>
+              </w:rPr>
+            </w:r>
+            <w:r>
+              <w:rPr>
+                <w:noProof/>
+                <w:webHidden/>
+              </w:rPr>
+              <w:fldChar w:fldCharType="separate"/>
+            </w:r>
+            <w:r>
+              <w:rPr>
+                <w:noProof/>
+                <w:webHidden/>
+              </w:rPr>
+              <w:t>18</w:t>
+            </w:r>
+            <w:r>
+              <w:rPr>
+                <w:noProof/>
+                <w:webHidden/>
+              </w:rPr>
+              <w:fldChar w:fldCharType="end"/>
+            </w:r>
+          </w:hyperlink>
+        </w:p>
+        <w:p>
+          <w:pPr>
+            <w:pStyle w:val="TOC2"/>
+            <w:tabs>
+              <w:tab w:val="right" w:leader="dot" w:pos="9350"/>
+            </w:tabs>
+            <w:rPr>
+              <w:rFonts w:eastAsiaTheme="minorEastAsia"/>
+              <w:noProof/>
+            </w:rPr>
+          </w:pPr>
+          <w:hyperlink w:anchor="_Toc197130522" w:history="1">
+            <w:r>
+              <w:rPr>
+                <w:rStyle w:val="Hyperlink"/>
+                <w:noProof/>
+              </w:rPr>
+              <w:t>Login Testing:</w:t>
+            </w:r>
+            <w:r>
+              <w:rPr>
+                <w:noProof/>
+                <w:webHidden/>
+              </w:rPr>
+              <w:tab/>
+            </w:r>
+            <w:r>
+              <w:rPr>
+                <w:noProof/>
+                <w:webHidden/>
+              </w:rPr>
+              <w:fldChar w:fldCharType="begin"/>
+            </w:r>
+            <w:r>
+              <w:rPr>
+                <w:noProof/>
+                <w:webHidden/>
+              </w:rPr>
+              <w:instrText xml:space="preserve"> PAGEREF _Toc197130522 \h </w:instrText>
+            </w:r>
+            <w:r>
+              <w:rPr>
+                <w:noProof/>
+                <w:webHidden/>
+              </w:rPr>
+            </w:r>
+            <w:r>
+              <w:rPr>
+                <w:noProof/>
+                <w:webHidden/>
+              </w:rPr>
+              <w:fldChar w:fldCharType="separate"/>
+            </w:r>
+            <w:r>
+              <w:rPr>
+                <w:noProof/>
+                <w:webHidden/>
+              </w:rPr>
+              <w:t>18</w:t>
+            </w:r>
+            <w:r>
+              <w:rPr>
+                <w:noProof/>
+                <w:webHidden/>
+              </w:rPr>
+              <w:fldChar w:fldCharType="end"/>
+            </w:r>
+          </w:hyperlink>
+        </w:p>
+        <w:p>
+          <w:pPr>
+            <w:pStyle w:val="TOC2"/>
+            <w:tabs>
+              <w:tab w:val="right" w:leader="dot" w:pos="9350"/>
+            </w:tabs>
+            <w:rPr>
+              <w:rFonts w:eastAsiaTheme="minorEastAsia"/>
+              <w:noProof/>
+            </w:rPr>
+          </w:pPr>
+          <w:hyperlink w:anchor="_Toc197130523" w:history="1">
+            <w:r>
+              <w:rPr>
+                <w:rStyle w:val="Hyperlink"/>
+                <w:noProof/>
+              </w:rPr>
+              <w:t>Forget password Testing:</w:t>
+            </w:r>
+            <w:r>
+              <w:rPr>
+                <w:noProof/>
+                <w:webHidden/>
+              </w:rPr>
+              <w:tab/>
+            </w:r>
+            <w:r>
+              <w:rPr>
+                <w:noProof/>
+                <w:webHidden/>
+              </w:rPr>
+              <w:fldChar w:fldCharType="begin"/>
+            </w:r>
+            <w:r>
+              <w:rPr>
+                <w:noProof/>
+                <w:webHidden/>
+              </w:rPr>
+              <w:instrText xml:space="preserve"> PAGEREF _Toc197130523 \h </w:instrText>
+            </w:r>
+            <w:r>
+              <w:rPr>
+                <w:noProof/>
+                <w:webHidden/>
+              </w:rPr>
+            </w:r>
+            <w:r>
+              <w:rPr>
+                <w:noProof/>
+                <w:webHidden/>
+              </w:rPr>
+              <w:fldChar w:fldCharType="separate"/>
+            </w:r>
+            <w:r>
+              <w:rPr>
+                <w:noProof/>
+                <w:webHidden/>
+              </w:rPr>
+              <w:t>18</w:t>
             </w:r>
             <w:r>
               <w:rPr>
@@ -1436,21 +2001,16 @@
             <w:rPr>
               <w:rFonts w:eastAsiaTheme="minorEastAsia"/>
               <w:noProof/>
-              <w:kern w:val="2"/>
-              <w:sz w:val="24"/>
-              <w:szCs w:val="24"/>
-              <w:lang w:val="en-GB" w:eastAsia="en-GB"/>
-              <w14:ligatures w14:val="standardContextual"/>
             </w:rPr>
           </w:pPr>
-          <w:hyperlink w:anchor="_Toc195383801" w:history="1">
+          <w:hyperlink w:anchor="_Toc197130524" w:history="1">
             <w:r>
               <w:rPr>
                 <w:rStyle w:val="Hyperlink"/>
-                <w:rFonts w:ascii="Times New Roman" w:hAnsi="Times New Roman" w:cs="Times New Roman"/>
-                <w:noProof/>
-              </w:rPr>
-              <w:t>Risk Management:</w:t>
+                <w:rFonts w:ascii="Times New Roman" w:eastAsia="Times New Roman" w:hAnsi="Times New Roman" w:cs="Times New Roman"/>
+                <w:noProof/>
+              </w:rPr>
+              <w:t>Automation Testing:</w:t>
             </w:r>
             <w:r>
               <w:rPr>
@@ -1471,7 +2031,7 @@
                 <w:noProof/>
                 <w:webHidden/>
               </w:rPr>
-              <w:instrText xml:space="preserve"> PAGEREF _Toc195383801 \h </w:instrText>
+              <w:instrText xml:space="preserve"> PAGEREF _Toc197130524 \h </w:instrText>
             </w:r>
             <w:r>
               <w:rPr>
@@ -1491,7 +2051,7 @@
                 <w:noProof/>
                 <w:webHidden/>
               </w:rPr>
-              <w:t>9</w:t>
+              <w:t>19</w:t>
             </w:r>
             <w:r>
               <w:rPr>
@@ -1511,21 +2071,16 @@
             <w:rPr>
               <w:rFonts w:eastAsiaTheme="minorEastAsia"/>
               <w:noProof/>
-              <w:kern w:val="2"/>
-              <w:sz w:val="24"/>
-              <w:szCs w:val="24"/>
-              <w:lang w:val="en-GB" w:eastAsia="en-GB"/>
-              <w14:ligatures w14:val="standardContextual"/>
             </w:rPr>
           </w:pPr>
-          <w:hyperlink w:anchor="_Toc195383802" w:history="1">
+          <w:hyperlink w:anchor="_Toc197130525" w:history="1">
             <w:r>
               <w:rPr>
                 <w:rStyle w:val="Hyperlink"/>
-                <w:rFonts w:ascii="Times New Roman" w:eastAsia="Times New Roman" w:hAnsi="Times New Roman" w:cs="Times New Roman"/>
-                <w:noProof/>
-              </w:rPr>
-              <w:t>GitHub Link:</w:t>
+                <w:rFonts w:ascii="Times New Roman" w:hAnsi="Times New Roman" w:cs="Times New Roman"/>
+                <w:noProof/>
+              </w:rPr>
+              <w:t>Risk Management:</w:t>
             </w:r>
             <w:r>
               <w:rPr>
@@ -1546,7 +2101,7 @@
                 <w:noProof/>
                 <w:webHidden/>
               </w:rPr>
-              <w:instrText xml:space="preserve"> PAGEREF _Toc195383802 \h </w:instrText>
+              <w:instrText xml:space="preserve"> PAGEREF _Toc197130525 \h </w:instrText>
             </w:r>
             <w:r>
               <w:rPr>
@@ -1566,7 +2121,7 @@
                 <w:noProof/>
                 <w:webHidden/>
               </w:rPr>
-              <w:t>9</w:t>
+              <w:t>20</w:t>
             </w:r>
             <w:r>
               <w:rPr>
@@ -1586,14 +2141,79 @@
             <w:rPr>
               <w:rFonts w:eastAsiaTheme="minorEastAsia"/>
               <w:noProof/>
-              <w:kern w:val="2"/>
-              <w:sz w:val="24"/>
-              <w:szCs w:val="24"/>
-              <w:lang w:val="en-GB" w:eastAsia="en-GB"/>
-              <w14:ligatures w14:val="standardContextual"/>
             </w:rPr>
           </w:pPr>
-          <w:hyperlink w:anchor="_Toc195383803" w:history="1">
+          <w:hyperlink w:anchor="_Toc197130526" w:history="1">
+            <w:r>
+              <w:rPr>
+                <w:rStyle w:val="Hyperlink"/>
+                <w:rFonts w:ascii="Times New Roman" w:eastAsia="Times New Roman" w:hAnsi="Times New Roman" w:cs="Times New Roman"/>
+                <w:noProof/>
+              </w:rPr>
+              <w:t>GitHub Link:</w:t>
+            </w:r>
+            <w:r>
+              <w:rPr>
+                <w:noProof/>
+                <w:webHidden/>
+              </w:rPr>
+              <w:tab/>
+            </w:r>
+            <w:r>
+              <w:rPr>
+                <w:noProof/>
+                <w:webHidden/>
+              </w:rPr>
+              <w:fldChar w:fldCharType="begin"/>
+            </w:r>
+            <w:r>
+              <w:rPr>
+                <w:noProof/>
+                <w:webHidden/>
+              </w:rPr>
+              <w:instrText xml:space="preserve"> PAGEREF _Toc197130526 \h </w:instrText>
+            </w:r>
+            <w:r>
+              <w:rPr>
+                <w:noProof/>
+                <w:webHidden/>
+              </w:rPr>
+            </w:r>
+            <w:r>
+              <w:rPr>
+                <w:noProof/>
+                <w:webHidden/>
+              </w:rPr>
+              <w:fldChar w:fldCharType="separate"/>
+            </w:r>
+            <w:r>
+              <w:rPr>
+                <w:noProof/>
+                <w:webHidden/>
+              </w:rPr>
+              <w:t>20</w:t>
+            </w:r>
+            <w:r>
+              <w:rPr>
+                <w:noProof/>
+                <w:webHidden/>
+              </w:rPr>
+              <w:fldChar w:fldCharType="end"/>
+            </w:r>
+          </w:hyperlink>
+        </w:p>
+        <w:p>
+          <w:pPr>
+            <w:pStyle w:val="TOC1"/>
+            <w:tabs>
+              <w:tab w:val="right" w:leader="dot" w:pos="9350"/>
+            </w:tabs>
+            <w:rPr>
+              <w:rFonts w:eastAsiaTheme="minorEastAsia"/>
+              <w:noProof/>
+            </w:rPr>
+          </w:pPr>
+          <w:hyperlink w:anchor="_Toc197130527" w:history="1">
             <w:r>
               <w:rPr>
                 <w:rStyle w:val="Hyperlink"/>
@@ -1621,7 +2241,7 @@
                 <w:noProof/>
                 <w:webHidden/>
               </w:rPr>
-              <w:instrText xml:space="preserve"> PAGEREF _Toc195383803 \h </w:instrText>
+              <w:instrText xml:space="preserve"> PAGEREF _Toc197130527 \h </w:instrText>
             </w:r>
             <w:r>
               <w:rPr>
@@ -1641,7 +2261,7 @@
                 <w:noProof/>
                 <w:webHidden/>
               </w:rPr>
-              <w:t>9</w:t>
+              <w:t>21</w:t>
             </w:r>
             <w:r>
               <w:rPr>
@@ -1709,78 +2329,6 @@
     </w:p>
     <w:p>
       <w:pPr>
-        <w:rPr>
-          <w:rFonts w:ascii="Times New Roman" w:hAnsi="Times New Roman" w:cs="Times New Roman"/>
-          <w:sz w:val="28"/>
-          <w:szCs w:val="28"/>
-        </w:rPr>
-      </w:pPr>
-    </w:p>
-    <w:p>
-      <w:pPr>
-        <w:rPr>
-          <w:rFonts w:ascii="Times New Roman" w:hAnsi="Times New Roman" w:cs="Times New Roman"/>
-          <w:sz w:val="28"/>
-          <w:szCs w:val="28"/>
-        </w:rPr>
-      </w:pPr>
-    </w:p>
-    <w:p>
-      <w:pPr>
-        <w:rPr>
-          <w:rFonts w:ascii="Times New Roman" w:hAnsi="Times New Roman" w:cs="Times New Roman"/>
-          <w:sz w:val="28"/>
-          <w:szCs w:val="28"/>
-        </w:rPr>
-      </w:pPr>
-    </w:p>
-    <w:p>
-      <w:pPr>
-        <w:rPr>
-          <w:rFonts w:ascii="Times New Roman" w:hAnsi="Times New Roman" w:cs="Times New Roman"/>
-          <w:sz w:val="28"/>
-          <w:szCs w:val="28"/>
-        </w:rPr>
-      </w:pPr>
-    </w:p>
-    <w:p>
-      <w:pPr>
-        <w:rPr>
-          <w:rFonts w:ascii="Times New Roman" w:hAnsi="Times New Roman" w:cs="Times New Roman"/>
-          <w:sz w:val="28"/>
-          <w:szCs w:val="28"/>
-        </w:rPr>
-      </w:pPr>
-    </w:p>
-    <w:p>
-      <w:pPr>
-        <w:rPr>
-          <w:rFonts w:ascii="Times New Roman" w:hAnsi="Times New Roman" w:cs="Times New Roman"/>
-          <w:sz w:val="28"/>
-          <w:szCs w:val="28"/>
-        </w:rPr>
-      </w:pPr>
-    </w:p>
-    <w:p>
-      <w:pPr>
-        <w:rPr>
-          <w:rFonts w:ascii="Times New Roman" w:hAnsi="Times New Roman" w:cs="Times New Roman"/>
-          <w:sz w:val="28"/>
-          <w:szCs w:val="28"/>
-        </w:rPr>
-      </w:pPr>
-    </w:p>
-    <w:p>
-      <w:pPr>
-        <w:rPr>
-          <w:rFonts w:ascii="Times New Roman" w:hAnsi="Times New Roman" w:cs="Times New Roman"/>
-          <w:sz w:val="28"/>
-          <w:szCs w:val="28"/>
-        </w:rPr>
-      </w:pPr>
-    </w:p>
-    <w:p>
-      <w:pPr>
         <w:pStyle w:val="Heading1"/>
         <w:rPr>
           <w:rFonts w:ascii="Times New Roman" w:hAnsi="Times New Roman" w:cs="Times New Roman"/>
@@ -1788,7 +2336,7 @@
           <w:szCs w:val="40"/>
         </w:rPr>
       </w:pPr>
-      <w:bookmarkStart w:id="0" w:name="_Toc195383789"/>
+      <w:bookmarkStart w:id="0" w:name="_Toc197130503"/>
       <w:r>
         <w:rPr>
           <w:rFonts w:ascii="Times New Roman" w:hAnsi="Times New Roman" w:cs="Times New Roman"/>
@@ -1998,7 +2546,7 @@
           <w:rFonts w:ascii="Times New Roman" w:hAnsi="Times New Roman" w:cs="Times New Roman"/>
         </w:rPr>
       </w:pPr>
-      <w:bookmarkStart w:id="1" w:name="_Toc195383790"/>
+      <w:bookmarkStart w:id="1" w:name="_Toc197130504"/>
       <w:r>
         <w:rPr>
           <w:rFonts w:ascii="Times New Roman" w:hAnsi="Times New Roman" w:cs="Times New Roman"/>
@@ -2253,7 +2801,7 @@
           <w:szCs w:val="40"/>
         </w:rPr>
       </w:pPr>
-      <w:bookmarkStart w:id="2" w:name="_Toc195383791"/>
+      <w:bookmarkStart w:id="2" w:name="_Toc197130505"/>
       <w:r>
         <w:rPr>
           <w:rFonts w:ascii="Times New Roman" w:hAnsi="Times New Roman" w:cs="Times New Roman"/>
@@ -2412,7 +2960,7 @@
           <w:szCs w:val="40"/>
         </w:rPr>
       </w:pPr>
-      <w:bookmarkStart w:id="3" w:name="_Toc195383792"/>
+      <w:bookmarkStart w:id="3" w:name="_Toc197130506"/>
       <w:r>
         <w:rPr>
           <w:rFonts w:ascii="Times New Roman" w:hAnsi="Times New Roman" w:cs="Times New Roman"/>
@@ -2451,7 +2999,7 @@
           <w:szCs w:val="28"/>
         </w:rPr>
       </w:pPr>
-      <w:bookmarkStart w:id="4" w:name="_Toc195383793"/>
+      <w:bookmarkStart w:id="4" w:name="_Toc197130507"/>
       <w:r>
         <w:rPr>
           <w:rFonts w:ascii="Times New Roman" w:hAnsi="Times New Roman" w:cs="Times New Roman"/>
@@ -2712,7 +3260,7 @@
           <w:szCs w:val="28"/>
         </w:rPr>
       </w:pPr>
-      <w:bookmarkStart w:id="5" w:name="_Toc195383794"/>
+      <w:bookmarkStart w:id="5" w:name="_Toc197130508"/>
       <w:r>
         <w:rPr>
           <w:rFonts w:ascii="Times New Roman" w:hAnsi="Times New Roman" w:cs="Times New Roman"/>
@@ -2891,7 +3439,7 @@
           <w:szCs w:val="40"/>
         </w:rPr>
       </w:pPr>
-      <w:bookmarkStart w:id="6" w:name="_Toc195383795"/>
+      <w:bookmarkStart w:id="6" w:name="_Toc197130509"/>
       <w:r>
         <w:rPr>
           <w:rFonts w:ascii="Times New Roman" w:hAnsi="Times New Roman" w:cs="Times New Roman"/>
@@ -3030,25 +3578,7 @@
           <w:sz w:val="28"/>
           <w:szCs w:val="28"/>
         </w:rPr>
-        <w:t xml:space="preserve">To link the </w:t>
-      </w:r>
-      <w:proofErr w:type="gramStart"/>
-      <w:r>
-        <w:rPr>
-          <w:rFonts w:ascii="Times New Roman" w:hAnsi="Times New Roman" w:cs="Times New Roman"/>
-          <w:sz w:val="28"/>
-          <w:szCs w:val="28"/>
-        </w:rPr>
-        <w:t>back-end</w:t>
-      </w:r>
-      <w:proofErr w:type="gramEnd"/>
-      <w:r>
-        <w:rPr>
-          <w:rFonts w:ascii="Times New Roman" w:hAnsi="Times New Roman" w:cs="Times New Roman"/>
-          <w:sz w:val="28"/>
-          <w:szCs w:val="28"/>
-        </w:rPr>
-        <w:t xml:space="preserve"> and the front-end, the front-end (React) sends requests to Django’s API. </w:t>
+        <w:t xml:space="preserve">To link the back-end and the front-end, the front-end (React) sends requests to Django’s API. </w:t>
       </w:r>
       <w:r>
         <w:rPr>
@@ -3090,25 +3620,7 @@
           <w:sz w:val="28"/>
           <w:szCs w:val="28"/>
         </w:rPr>
-        <w:t xml:space="preserve">GitHub was used as version control that provided efficient merging between all branches so </w:t>
-      </w:r>
-      <w:proofErr w:type="gramStart"/>
-      <w:r>
-        <w:rPr>
-          <w:rFonts w:ascii="Times New Roman" w:hAnsi="Times New Roman" w:cs="Times New Roman"/>
-          <w:sz w:val="28"/>
-          <w:szCs w:val="28"/>
-        </w:rPr>
-        <w:t>team</w:t>
-      </w:r>
-      <w:proofErr w:type="gramEnd"/>
-      <w:r>
-        <w:rPr>
-          <w:rFonts w:ascii="Times New Roman" w:hAnsi="Times New Roman" w:cs="Times New Roman"/>
-          <w:sz w:val="28"/>
-          <w:szCs w:val="28"/>
-        </w:rPr>
-        <w:t xml:space="preserve"> can work together.</w:t>
+        <w:t>GitHub was used as version control that provided efficient merging between all branches so team can work together.</w:t>
       </w:r>
     </w:p>
     <w:p>
@@ -3239,7 +3751,7 @@
           <w:szCs w:val="40"/>
         </w:rPr>
       </w:pPr>
-      <w:bookmarkStart w:id="7" w:name="_Toc195383796"/>
+      <w:bookmarkStart w:id="7" w:name="_Toc197130510"/>
       <w:r>
         <w:rPr>
           <w:sz w:val="40"/>
@@ -3299,9 +3811,7 @@
     <w:p/>
     <w:p/>
     <w:p/>
-    <w:p>
-      <w:bookmarkStart w:id="8" w:name="_Toc195383797"/>
-    </w:p>
+    <w:p/>
     <w:p>
       <w:pPr>
         <w:pStyle w:val="Heading1"/>
@@ -3311,6 +3821,7 @@
           <w:szCs w:val="22"/>
         </w:rPr>
       </w:pPr>
+      <w:bookmarkStart w:id="8" w:name="_Toc197130511"/>
       <w:r>
         <w:lastRenderedPageBreak/>
         <w:t xml:space="preserve">Product </w:t>
@@ -3333,6 +3844,7 @@
           <w:szCs w:val="32"/>
         </w:rPr>
       </w:pPr>
+      <w:bookmarkStart w:id="9" w:name="_Toc197130512"/>
       <w:r>
         <w:rPr>
           <w:rFonts w:ascii="Times New Roman" w:hAnsi="Times New Roman" w:cs="Times New Roman"/>
@@ -3341,6 +3853,7 @@
         </w:rPr>
         <w:t>Sprint 1</w:t>
       </w:r>
+      <w:bookmarkEnd w:id="9"/>
     </w:p>
     <w:p/>
     <w:p>
@@ -3411,7 +3924,6 @@
           <w:color w:val="auto"/>
         </w:rPr>
       </w:pPr>
-      <w:bookmarkStart w:id="9" w:name="_Toc195383798"/>
     </w:p>
     <w:p>
       <w:pPr>
@@ -3422,6 +3934,7 @@
           <w:szCs w:val="32"/>
         </w:rPr>
       </w:pPr>
+      <w:bookmarkStart w:id="10" w:name="_Toc197130513"/>
       <w:r>
         <w:rPr>
           <w:rFonts w:ascii="Times New Roman" w:eastAsia="Times New Roman" w:hAnsi="Times New Roman" w:cs="Times New Roman"/>
@@ -3430,6 +3943,7 @@
         </w:rPr>
         <w:t>Sprint 2</w:t>
       </w:r>
+      <w:bookmarkEnd w:id="10"/>
     </w:p>
     <w:p/>
     <w:p>
@@ -3503,6 +4017,7 @@
           <w:szCs w:val="32"/>
         </w:rPr>
       </w:pPr>
+      <w:bookmarkStart w:id="11" w:name="_Toc197130514"/>
       <w:r>
         <w:rPr>
           <w:rFonts w:ascii="Times New Roman" w:hAnsi="Times New Roman" w:cs="Times New Roman"/>
@@ -3512,6 +4027,7 @@
         <w:lastRenderedPageBreak/>
         <w:t>Sprint 3</w:t>
       </w:r>
+      <w:bookmarkEnd w:id="11"/>
     </w:p>
     <w:p/>
     <w:p>
@@ -3567,26 +4083,28 @@
           <w:szCs w:val="32"/>
         </w:rPr>
       </w:pPr>
+      <w:bookmarkStart w:id="12" w:name="_Toc197130515"/>
       <w:r>
         <w:rPr>
           <w:rFonts w:ascii="Times New Roman" w:hAnsi="Times New Roman" w:cs="Times New Roman"/>
           <w:sz w:val="32"/>
           <w:szCs w:val="32"/>
         </w:rPr>
+        <w:lastRenderedPageBreak/>
         <w:t>Sprint 4</w:t>
       </w:r>
-    </w:p>
-    <w:p/>
+      <w:bookmarkEnd w:id="12"/>
+    </w:p>
     <w:p>
       <w:r>
         <w:rPr>
           <w:noProof/>
         </w:rPr>
         <w:drawing>
-          <wp:inline distT="0" distB="0" distL="0" distR="0" wp14:anchorId="6E5C2764" wp14:editId="3D6ABE4E">
-            <wp:extent cx="5798634" cy="2590800"/>
-            <wp:effectExtent l="0" t="0" r="0" b="0"/>
-            <wp:docPr id="1899481229" name="Picture 1" descr="A screenshot of a computer&#10;&#10;AI-generated content may be incorrect."/>
+          <wp:inline distT="0" distB="0" distL="0" distR="0" wp14:anchorId="5E519F4F" wp14:editId="7C5971D0">
+            <wp:extent cx="2552700" cy="4638675"/>
+            <wp:effectExtent l="0" t="0" r="0" b="9525"/>
+            <wp:docPr id="7" name="Picture 7"/>
             <wp:cNvGraphicFramePr>
               <a:graphicFrameLocks xmlns:a="http://schemas.openxmlformats.org/drawingml/2006/main" noChangeAspect="1"/>
             </wp:cNvGraphicFramePr>
@@ -3594,7 +4112,7 @@
               <a:graphicData uri="http://schemas.openxmlformats.org/drawingml/2006/picture">
                 <pic:pic xmlns:pic="http://schemas.openxmlformats.org/drawingml/2006/picture">
                   <pic:nvPicPr>
-                    <pic:cNvPr id="1899481229" name="Picture 1" descr="A screenshot of a computer&#10;&#10;AI-generated content may be incorrect."/>
+                    <pic:cNvPr id="1" name=""/>
                     <pic:cNvPicPr/>
                   </pic:nvPicPr>
                   <pic:blipFill>
@@ -3606,7 +4124,7 @@
                   <pic:spPr>
                     <a:xfrm>
                       <a:off x="0" y="0"/>
-                      <a:ext cx="5800152" cy="2591478"/>
+                      <a:ext cx="2552700" cy="4638675"/>
                     </a:xfrm>
                     <a:prstGeom prst="rect">
                       <a:avLst/>
@@ -3619,75 +4137,37 @@
         </w:drawing>
       </w:r>
     </w:p>
-    <w:p/>
-    <w:p>
-      <w:pPr>
-        <w:pStyle w:val="Heading1"/>
-        <w:rPr>
-          <w:rFonts w:ascii="Times New Roman" w:eastAsia="Times New Roman" w:hAnsi="Times New Roman" w:cs="Times New Roman"/>
-          <w:color w:val="auto"/>
-        </w:rPr>
-      </w:pPr>
-      <w:r>
-        <w:rPr>
-          <w:rFonts w:ascii="Times New Roman" w:eastAsia="Times New Roman" w:hAnsi="Times New Roman" w:cs="Times New Roman"/>
-          <w:color w:val="auto"/>
-        </w:rPr>
-        <w:lastRenderedPageBreak/>
-        <w:t>Quality assurance:</w:t>
-      </w:r>
-    </w:p>
-    <w:p>
-      <w:pPr>
-        <w:pStyle w:val="Heading1"/>
-        <w:rPr>
-          <w:rFonts w:ascii="Times New Roman" w:eastAsia="Times New Roman" w:hAnsi="Times New Roman" w:cs="Times New Roman"/>
-          <w:color w:val="auto"/>
-        </w:rPr>
-      </w:pPr>
-      <w:r>
-        <w:rPr>
-          <w:rFonts w:ascii="Times New Roman" w:eastAsia="Times New Roman" w:hAnsi="Times New Roman" w:cs="Times New Roman"/>
-          <w:color w:val="auto"/>
-        </w:rPr>
-        <w:t>Diagrams:</w:t>
-      </w:r>
-      <w:bookmarkEnd w:id="9"/>
-    </w:p>
-    <w:p>
-      <w:pPr>
-        <w:rPr>
-          <w:rFonts w:ascii="Arial" w:hAnsi="Arial" w:cs="Arial"/>
+    <w:p>
+      <w:pPr>
+        <w:pStyle w:val="Heading2"/>
+        <w:rPr>
+          <w:rFonts w:ascii="Times New Roman" w:hAnsi="Times New Roman" w:cs="Times New Roman"/>
           <w:sz w:val="32"/>
           <w:szCs w:val="32"/>
         </w:rPr>
       </w:pPr>
-      <w:r>
-        <w:rPr>
-          <w:rFonts w:ascii="Arial" w:hAnsi="Arial" w:cs="Arial"/>
+      <w:bookmarkStart w:id="13" w:name="_Toc197130516"/>
+      <w:r>
+        <w:rPr>
+          <w:rFonts w:ascii="Times New Roman" w:hAnsi="Times New Roman" w:cs="Times New Roman"/>
           <w:sz w:val="32"/>
           <w:szCs w:val="32"/>
         </w:rPr>
-        <w:t>Use case Diagram:</w:t>
-      </w:r>
-    </w:p>
-    <w:p>
-      <w:pPr>
-        <w:rPr>
-          <w:rFonts w:ascii="Arial" w:hAnsi="Arial" w:cs="Arial"/>
-          <w:sz w:val="28"/>
-          <w:szCs w:val="28"/>
-        </w:rPr>
-      </w:pPr>
+        <w:lastRenderedPageBreak/>
+        <w:t>Sprint 5:</w:t>
+      </w:r>
+      <w:bookmarkEnd w:id="13"/>
+    </w:p>
+    <w:p>
       <w:r>
         <w:rPr>
           <w:noProof/>
         </w:rPr>
         <w:drawing>
-          <wp:inline distT="0" distB="0" distL="0" distR="0" wp14:anchorId="46E4C253" wp14:editId="4339D159">
-            <wp:extent cx="5943600" cy="4881880"/>
-            <wp:effectExtent l="0" t="0" r="0" b="0"/>
-            <wp:docPr id="2" name="Picture 2"/>
+          <wp:inline distT="0" distB="0" distL="0" distR="0" wp14:anchorId="35E20B9A" wp14:editId="3BE3EB36">
+            <wp:extent cx="2428875" cy="5000625"/>
+            <wp:effectExtent l="0" t="0" r="9525" b="9525"/>
+            <wp:docPr id="8" name="Picture 8"/>
             <wp:cNvGraphicFramePr>
               <a:graphicFrameLocks xmlns:a="http://schemas.openxmlformats.org/drawingml/2006/main" noChangeAspect="1"/>
             </wp:cNvGraphicFramePr>
@@ -3707,7 +4187,7 @@
                   <pic:spPr>
                     <a:xfrm>
                       <a:off x="0" y="0"/>
-                      <a:ext cx="5943600" cy="4881880"/>
+                      <a:ext cx="2428875" cy="5000625"/>
                     </a:xfrm>
                     <a:prstGeom prst="rect">
                       <a:avLst/>
@@ -3719,23 +4199,101 @@
           </wp:inline>
         </w:drawing>
       </w:r>
-      <w:r>
+    </w:p>
+    <w:p>
+      <w:pPr>
+        <w:pStyle w:val="Heading2"/>
+        <w:rPr>
+          <w:rFonts w:ascii="Times New Roman" w:hAnsi="Times New Roman" w:cs="Times New Roman"/>
+          <w:sz w:val="32"/>
+          <w:szCs w:val="32"/>
+        </w:rPr>
+      </w:pPr>
+      <w:bookmarkStart w:id="14" w:name="_Toc197130517"/>
+      <w:r>
+        <w:rPr>
+          <w:rFonts w:ascii="Times New Roman" w:hAnsi="Times New Roman" w:cs="Times New Roman"/>
+          <w:sz w:val="32"/>
+          <w:szCs w:val="32"/>
+        </w:rPr>
+        <w:t>Sprint 6:</w:t>
+      </w:r>
+      <w:bookmarkEnd w:id="14"/>
+    </w:p>
+    <w:p>
+      <w:pPr>
+        <w:pStyle w:val="Heading1"/>
+        <w:rPr>
+          <w:rFonts w:ascii="Times New Roman" w:eastAsia="Times New Roman" w:hAnsi="Times New Roman" w:cs="Times New Roman"/>
+          <w:color w:val="auto"/>
+        </w:rPr>
+      </w:pPr>
+      <w:bookmarkStart w:id="15" w:name="_Toc197130518"/>
+      <w:r>
+        <w:rPr>
+          <w:rFonts w:ascii="Times New Roman" w:eastAsia="Times New Roman" w:hAnsi="Times New Roman" w:cs="Times New Roman"/>
+          <w:color w:val="auto"/>
+        </w:rPr>
+        <w:t>Quality assurance:</w:t>
+      </w:r>
+      <w:bookmarkEnd w:id="15"/>
+    </w:p>
+    <w:p>
+      <w:pPr>
+        <w:pStyle w:val="Heading1"/>
+        <w:rPr>
+          <w:rFonts w:ascii="Times New Roman" w:eastAsia="Times New Roman" w:hAnsi="Times New Roman" w:cs="Times New Roman"/>
+          <w:color w:val="auto"/>
+        </w:rPr>
+      </w:pPr>
+    </w:p>
+    <w:p>
+      <w:pPr>
+        <w:pStyle w:val="Heading1"/>
+        <w:rPr>
+          <w:rFonts w:ascii="Times New Roman" w:eastAsia="Times New Roman" w:hAnsi="Times New Roman" w:cs="Times New Roman"/>
+          <w:color w:val="auto"/>
+        </w:rPr>
+      </w:pPr>
+    </w:p>
+    <w:p/>
+    <w:p/>
+    <w:p/>
+    <w:p>
+      <w:pPr>
+        <w:pStyle w:val="Heading1"/>
+        <w:rPr>
+          <w:rFonts w:ascii="Times New Roman" w:eastAsia="Times New Roman" w:hAnsi="Times New Roman" w:cs="Times New Roman"/>
+          <w:color w:val="auto"/>
+        </w:rPr>
+      </w:pPr>
+      <w:bookmarkStart w:id="16" w:name="_Toc197130519"/>
+      <w:r>
+        <w:rPr>
+          <w:rFonts w:ascii="Times New Roman" w:eastAsia="Times New Roman" w:hAnsi="Times New Roman" w:cs="Times New Roman"/>
+          <w:color w:val="auto"/>
+        </w:rPr>
+        <w:lastRenderedPageBreak/>
+        <w:t>Diagrams:</w:t>
+      </w:r>
+      <w:bookmarkEnd w:id="16"/>
+    </w:p>
+    <w:p>
+      <w:pPr>
         <w:rPr>
           <w:rFonts w:ascii="Arial" w:hAnsi="Arial" w:cs="Arial"/>
-          <w:sz w:val="28"/>
-          <w:szCs w:val="28"/>
-        </w:rPr>
-        <w:br/>
-      </w:r>
-    </w:p>
-    <w:p>
-      <w:pPr>
+          <w:sz w:val="32"/>
+          <w:szCs w:val="32"/>
+        </w:rPr>
+      </w:pPr>
+      <w:r>
         <w:rPr>
           <w:rFonts w:ascii="Arial" w:hAnsi="Arial" w:cs="Arial"/>
-          <w:sz w:val="28"/>
-          <w:szCs w:val="28"/>
-        </w:rPr>
-      </w:pPr>
+          <w:sz w:val="32"/>
+          <w:szCs w:val="32"/>
+        </w:rPr>
+        <w:t>Use case Diagram:</w:t>
+      </w:r>
     </w:p>
     <w:p>
       <w:pPr>
@@ -3745,110 +4303,15 @@
           <w:szCs w:val="28"/>
         </w:rPr>
       </w:pPr>
-    </w:p>
-    <w:p>
-      <w:pPr>
-        <w:rPr>
-          <w:rFonts w:ascii="Arial" w:hAnsi="Arial" w:cs="Arial"/>
-          <w:sz w:val="28"/>
-          <w:szCs w:val="28"/>
-        </w:rPr>
-      </w:pPr>
-    </w:p>
-    <w:p>
-      <w:pPr>
-        <w:rPr>
-          <w:rFonts w:ascii="Arial" w:hAnsi="Arial" w:cs="Arial"/>
-          <w:sz w:val="28"/>
-          <w:szCs w:val="28"/>
-        </w:rPr>
-      </w:pPr>
-    </w:p>
-    <w:p>
-      <w:pPr>
-        <w:rPr>
-          <w:rFonts w:ascii="Arial" w:hAnsi="Arial" w:cs="Arial"/>
-          <w:sz w:val="28"/>
-          <w:szCs w:val="28"/>
-        </w:rPr>
-      </w:pPr>
-    </w:p>
-    <w:p>
-      <w:pPr>
-        <w:rPr>
-          <w:rFonts w:ascii="Arial" w:hAnsi="Arial" w:cs="Arial"/>
-          <w:sz w:val="28"/>
-          <w:szCs w:val="28"/>
-        </w:rPr>
-      </w:pPr>
-    </w:p>
-    <w:p>
-      <w:pPr>
-        <w:rPr>
-          <w:rFonts w:ascii="Arial" w:hAnsi="Arial" w:cs="Arial"/>
-          <w:sz w:val="28"/>
-          <w:szCs w:val="28"/>
-        </w:rPr>
-      </w:pPr>
-      <w:r>
-        <w:rPr>
-          <w:rFonts w:ascii="Arial" w:hAnsi="Arial" w:cs="Arial"/>
-          <w:sz w:val="28"/>
-          <w:szCs w:val="28"/>
-        </w:rPr>
-        <w:lastRenderedPageBreak/>
-        <w:t xml:space="preserve">Activity </w:t>
-      </w:r>
-      <w:r>
-        <w:rPr>
-          <w:rFonts w:ascii="Arial" w:hAnsi="Arial" w:cs="Arial"/>
-          <w:sz w:val="28"/>
-          <w:szCs w:val="28"/>
-        </w:rPr>
-        <w:t>diagram (</w:t>
-      </w:r>
-      <w:r>
-        <w:rPr>
-          <w:rFonts w:ascii="Arial" w:hAnsi="Arial" w:cs="Arial"/>
-          <w:sz w:val="28"/>
-          <w:szCs w:val="28"/>
-        </w:rPr>
-        <w:t xml:space="preserve">User </w:t>
-      </w:r>
-      <w:r>
-        <w:rPr>
-          <w:rFonts w:ascii="Arial" w:hAnsi="Arial" w:cs="Arial"/>
-          <w:sz w:val="28"/>
-          <w:szCs w:val="28"/>
-        </w:rPr>
-        <w:t>Registration</w:t>
-      </w:r>
-      <w:r>
-        <w:rPr>
-          <w:rFonts w:ascii="Arial" w:hAnsi="Arial" w:cs="Arial"/>
-          <w:sz w:val="28"/>
-          <w:szCs w:val="28"/>
-        </w:rPr>
-        <w:t>):</w:t>
-      </w:r>
-    </w:p>
-    <w:p>
-      <w:pPr>
-        <w:rPr>
-          <w:rFonts w:ascii="Arial" w:hAnsi="Arial" w:cs="Arial"/>
-          <w:sz w:val="28"/>
-          <w:szCs w:val="28"/>
-        </w:rPr>
-      </w:pPr>
       <w:r>
         <w:rPr>
           <w:noProof/>
         </w:rPr>
         <w:drawing>
-          <wp:inline distT="0" distB="0" distL="0" distR="0" wp14:anchorId="41EFED9D" wp14:editId="2C7B7D06">
-            <wp:extent cx="3933825" cy="5667375"/>
-            <wp:effectExtent l="0" t="0" r="9525" b="9525"/>
-            <wp:docPr id="3" name="Picture 3"/>
+          <wp:inline distT="0" distB="0" distL="0" distR="0" wp14:anchorId="46E4C253" wp14:editId="4339D159">
+            <wp:extent cx="5943600" cy="4881880"/>
+            <wp:effectExtent l="0" t="0" r="0" b="0"/>
+            <wp:docPr id="2" name="Picture 2"/>
             <wp:cNvGraphicFramePr>
               <a:graphicFrameLocks xmlns:a="http://schemas.openxmlformats.org/drawingml/2006/main" noChangeAspect="1"/>
             </wp:cNvGraphicFramePr>
@@ -3868,7 +4331,7 @@
                   <pic:spPr>
                     <a:xfrm>
                       <a:off x="0" y="0"/>
-                      <a:ext cx="3933825" cy="5667375"/>
+                      <a:ext cx="5943600" cy="4881880"/>
                     </a:xfrm>
                     <a:prstGeom prst="rect">
                       <a:avLst/>
@@ -3880,15 +4343,14 @@
           </wp:inline>
         </w:drawing>
       </w:r>
-    </w:p>
-    <w:p>
-      <w:pPr>
+      <w:r>
         <w:rPr>
           <w:rFonts w:ascii="Arial" w:hAnsi="Arial" w:cs="Arial"/>
           <w:sz w:val="28"/>
           <w:szCs w:val="28"/>
         </w:rPr>
-      </w:pPr>
+        <w:br/>
+      </w:r>
     </w:p>
     <w:p>
       <w:pPr>
@@ -3943,33 +4405,83 @@
           <w:szCs w:val="28"/>
         </w:rPr>
       </w:pPr>
-      <w:r>
+    </w:p>
+    <w:p>
+      <w:pPr>
         <w:rPr>
           <w:rFonts w:ascii="Arial" w:hAnsi="Arial" w:cs="Arial"/>
           <w:sz w:val="28"/>
           <w:szCs w:val="28"/>
         </w:rPr>
+      </w:pPr>
+    </w:p>
+    <w:p>
+      <w:pPr>
+        <w:rPr>
+          <w:rFonts w:ascii="Arial" w:hAnsi="Arial" w:cs="Arial"/>
+          <w:sz w:val="28"/>
+          <w:szCs w:val="28"/>
+        </w:rPr>
+      </w:pPr>
+      <w:r>
+        <w:rPr>
+          <w:rFonts w:ascii="Arial" w:hAnsi="Arial" w:cs="Arial"/>
+          <w:sz w:val="28"/>
+          <w:szCs w:val="28"/>
+        </w:rPr>
         <w:lastRenderedPageBreak/>
-        <w:t>Sequential diagram (managing events):</w:t>
-      </w:r>
-    </w:p>
-    <w:p>
-      <w:pPr>
+        <w:t xml:space="preserve">Activity </w:t>
+      </w:r>
+      <w:r>
         <w:rPr>
           <w:rFonts w:ascii="Arial" w:hAnsi="Arial" w:cs="Arial"/>
           <w:sz w:val="28"/>
           <w:szCs w:val="28"/>
         </w:rPr>
+        <w:t>diagram (</w:t>
+      </w:r>
+      <w:r>
+        <w:rPr>
+          <w:rFonts w:ascii="Arial" w:hAnsi="Arial" w:cs="Arial"/>
+          <w:sz w:val="28"/>
+          <w:szCs w:val="28"/>
+        </w:rPr>
+        <w:t xml:space="preserve">User </w:t>
+      </w:r>
+      <w:r>
+        <w:rPr>
+          <w:rFonts w:ascii="Arial" w:hAnsi="Arial" w:cs="Arial"/>
+          <w:sz w:val="28"/>
+          <w:szCs w:val="28"/>
+        </w:rPr>
+        <w:t>Registration</w:t>
+      </w:r>
+      <w:r>
+        <w:rPr>
+          <w:rFonts w:ascii="Arial" w:hAnsi="Arial" w:cs="Arial"/>
+          <w:sz w:val="28"/>
+          <w:szCs w:val="28"/>
+        </w:rPr>
+        <w:t>):</w:t>
+      </w:r>
+    </w:p>
+    <w:p>
+      <w:pPr>
+        <w:rPr>
+          <w:rFonts w:ascii="Arial" w:hAnsi="Arial" w:cs="Arial"/>
+          <w:sz w:val="28"/>
+          <w:szCs w:val="28"/>
+        </w:rPr>
       </w:pPr>
       <w:r>
         <w:rPr>
           <w:noProof/>
         </w:rPr>
         <w:drawing>
-          <wp:inline distT="0" distB="0" distL="0" distR="0" wp14:anchorId="05B78180" wp14:editId="6BEFB1B6">
-            <wp:extent cx="5172075" cy="5934075"/>
+          <wp:inline distT="0" distB="0" distL="0" distR="0" wp14:anchorId="41EFED9D" wp14:editId="2C7B7D06">
+            <wp:extent cx="3933825" cy="5667375"/>
             <wp:effectExtent l="0" t="0" r="9525" b="9525"/>
-            <wp:docPr id="4" name="Picture 4"/>
+            <wp:docPr id="3" name="Picture 3"/>
             <wp:cNvGraphicFramePr>
               <a:graphicFrameLocks xmlns:a="http://schemas.openxmlformats.org/drawingml/2006/main" noChangeAspect="1"/>
             </wp:cNvGraphicFramePr>
@@ -3989,7 +4501,7 @@
                   <pic:spPr>
                     <a:xfrm>
                       <a:off x="0" y="0"/>
-                      <a:ext cx="5172075" cy="5934075"/>
+                      <a:ext cx="3933825" cy="5667375"/>
                     </a:xfrm>
                     <a:prstGeom prst="rect">
                       <a:avLst/>
@@ -4071,7 +4583,7 @@
           <w:szCs w:val="28"/>
         </w:rPr>
         <w:lastRenderedPageBreak/>
-        <w:t>Sequential Diagram (Adding events):</w:t>
+        <w:t>Sequential diagram (managing events):</w:t>
       </w:r>
     </w:p>
     <w:p>
@@ -4087,10 +4599,10 @@
           <w:noProof/>
         </w:rPr>
         <w:drawing>
-          <wp:inline distT="0" distB="0" distL="0" distR="0" wp14:anchorId="62EA2854" wp14:editId="4C1A1BF2">
-            <wp:extent cx="4810125" cy="5867400"/>
-            <wp:effectExtent l="0" t="0" r="9525" b="0"/>
-            <wp:docPr id="5" name="Picture 5"/>
+          <wp:inline distT="0" distB="0" distL="0" distR="0" wp14:anchorId="05B78180" wp14:editId="6BEFB1B6">
+            <wp:extent cx="5172075" cy="5934075"/>
+            <wp:effectExtent l="0" t="0" r="9525" b="9525"/>
+            <wp:docPr id="4" name="Picture 4"/>
             <wp:cNvGraphicFramePr>
               <a:graphicFrameLocks xmlns:a="http://schemas.openxmlformats.org/drawingml/2006/main" noChangeAspect="1"/>
             </wp:cNvGraphicFramePr>
@@ -4110,7 +4622,7 @@
                   <pic:spPr>
                     <a:xfrm>
                       <a:off x="0" y="0"/>
-                      <a:ext cx="4810125" cy="5867400"/>
+                      <a:ext cx="5172075" cy="5934075"/>
                     </a:xfrm>
                     <a:prstGeom prst="rect">
                       <a:avLst/>
@@ -4131,32 +4643,87 @@
           <w:szCs w:val="28"/>
         </w:rPr>
       </w:pPr>
-      <w:r>
+    </w:p>
+    <w:p>
+      <w:pPr>
         <w:rPr>
           <w:rFonts w:ascii="Arial" w:hAnsi="Arial" w:cs="Arial"/>
           <w:sz w:val="28"/>
           <w:szCs w:val="28"/>
         </w:rPr>
+      </w:pPr>
+    </w:p>
+    <w:p>
+      <w:pPr>
+        <w:rPr>
+          <w:rFonts w:ascii="Arial" w:hAnsi="Arial" w:cs="Arial"/>
+          <w:sz w:val="28"/>
+          <w:szCs w:val="28"/>
+        </w:rPr>
+      </w:pPr>
+    </w:p>
+    <w:p>
+      <w:pPr>
+        <w:rPr>
+          <w:rFonts w:ascii="Arial" w:hAnsi="Arial" w:cs="Arial"/>
+          <w:sz w:val="28"/>
+          <w:szCs w:val="28"/>
+        </w:rPr>
+      </w:pPr>
+    </w:p>
+    <w:p>
+      <w:pPr>
+        <w:rPr>
+          <w:rFonts w:ascii="Arial" w:hAnsi="Arial" w:cs="Arial"/>
+          <w:sz w:val="28"/>
+          <w:szCs w:val="28"/>
+        </w:rPr>
+      </w:pPr>
+    </w:p>
+    <w:p>
+      <w:pPr>
+        <w:rPr>
+          <w:rFonts w:ascii="Arial" w:hAnsi="Arial" w:cs="Arial"/>
+          <w:sz w:val="28"/>
+          <w:szCs w:val="28"/>
+        </w:rPr>
+      </w:pPr>
+    </w:p>
+    <w:p>
+      <w:pPr>
+        <w:rPr>
+          <w:rFonts w:ascii="Arial" w:hAnsi="Arial" w:cs="Arial"/>
+          <w:sz w:val="28"/>
+          <w:szCs w:val="28"/>
+        </w:rPr>
+      </w:pPr>
+      <w:r>
+        <w:rPr>
+          <w:rFonts w:ascii="Arial" w:hAnsi="Arial" w:cs="Arial"/>
+          <w:sz w:val="28"/>
+          <w:szCs w:val="28"/>
+        </w:rPr>
         <w:lastRenderedPageBreak/>
-        <w:t>Activity Diagram (Login in):</w:t>
-      </w:r>
-      <w:r>
+        <w:t>Sequential Diagram (Adding events):</w:t>
+      </w:r>
+    </w:p>
+    <w:p>
+      <w:pPr>
         <w:rPr>
           <w:rFonts w:ascii="Arial" w:hAnsi="Arial" w:cs="Arial"/>
           <w:sz w:val="28"/>
           <w:szCs w:val="28"/>
         </w:rPr>
-        <w:br/>
-      </w:r>
+      </w:pPr>
       <w:r>
         <w:rPr>
           <w:noProof/>
         </w:rPr>
         <w:drawing>
-          <wp:inline distT="0" distB="0" distL="0" distR="0" wp14:anchorId="22571738" wp14:editId="022294C4">
-            <wp:extent cx="2514600" cy="5248275"/>
-            <wp:effectExtent l="0" t="0" r="0" b="9525"/>
-            <wp:docPr id="6" name="Picture 6"/>
+          <wp:inline distT="0" distB="0" distL="0" distR="0" wp14:anchorId="62EA2854" wp14:editId="4C1A1BF2">
+            <wp:extent cx="4810125" cy="5867400"/>
+            <wp:effectExtent l="0" t="0" r="9525" b="0"/>
+            <wp:docPr id="5" name="Picture 5"/>
             <wp:cNvGraphicFramePr>
               <a:graphicFrameLocks xmlns:a="http://schemas.openxmlformats.org/drawingml/2006/main" noChangeAspect="1"/>
             </wp:cNvGraphicFramePr>
@@ -4176,6 +4743,72 @@
                   <pic:spPr>
                     <a:xfrm>
                       <a:off x="0" y="0"/>
+                      <a:ext cx="4810125" cy="5867400"/>
+                    </a:xfrm>
+                    <a:prstGeom prst="rect">
+                      <a:avLst/>
+                    </a:prstGeom>
+                  </pic:spPr>
+                </pic:pic>
+              </a:graphicData>
+            </a:graphic>
+          </wp:inline>
+        </w:drawing>
+      </w:r>
+    </w:p>
+    <w:p>
+      <w:pPr>
+        <w:rPr>
+          <w:rFonts w:ascii="Arial" w:hAnsi="Arial" w:cs="Arial"/>
+          <w:sz w:val="28"/>
+          <w:szCs w:val="28"/>
+        </w:rPr>
+      </w:pPr>
+      <w:r>
+        <w:rPr>
+          <w:rFonts w:ascii="Arial" w:hAnsi="Arial" w:cs="Arial"/>
+          <w:sz w:val="28"/>
+          <w:szCs w:val="28"/>
+        </w:rPr>
+        <w:lastRenderedPageBreak/>
+        <w:t>Activity Diagram (Login in):</w:t>
+      </w:r>
+      <w:r>
+        <w:rPr>
+          <w:rFonts w:ascii="Arial" w:hAnsi="Arial" w:cs="Arial"/>
+          <w:sz w:val="28"/>
+          <w:szCs w:val="28"/>
+        </w:rPr>
+        <w:br/>
+      </w:r>
+      <w:r>
+        <w:rPr>
+          <w:noProof/>
+        </w:rPr>
+        <w:drawing>
+          <wp:inline distT="0" distB="0" distL="0" distR="0" wp14:anchorId="22571738" wp14:editId="022294C4">
+            <wp:extent cx="2514600" cy="5248275"/>
+            <wp:effectExtent l="0" t="0" r="0" b="9525"/>
+            <wp:docPr id="6" name="Picture 6"/>
+            <wp:cNvGraphicFramePr>
+              <a:graphicFrameLocks xmlns:a="http://schemas.openxmlformats.org/drawingml/2006/main" noChangeAspect="1"/>
+            </wp:cNvGraphicFramePr>
+            <a:graphic xmlns:a="http://schemas.openxmlformats.org/drawingml/2006/main">
+              <a:graphicData uri="http://schemas.openxmlformats.org/drawingml/2006/picture">
+                <pic:pic xmlns:pic="http://schemas.openxmlformats.org/drawingml/2006/picture">
+                  <pic:nvPicPr>
+                    <pic:cNvPr id="1" name=""/>
+                    <pic:cNvPicPr/>
+                  </pic:nvPicPr>
+                  <pic:blipFill>
+                    <a:blip r:embed="rId18"/>
+                    <a:stretch>
+                      <a:fillRect/>
+                    </a:stretch>
+                  </pic:blipFill>
+                  <pic:spPr>
+                    <a:xfrm>
+                      <a:off x="0" y="0"/>
                       <a:ext cx="2514600" cy="5248275"/>
                     </a:xfrm>
                     <a:prstGeom prst="rect">
@@ -4191,58 +4824,474 @@
     </w:p>
     <w:p>
       <w:pPr>
+        <w:rPr>
+          <w:rFonts w:ascii="Arial" w:hAnsi="Arial" w:cs="Arial"/>
+          <w:sz w:val="28"/>
+          <w:szCs w:val="28"/>
+        </w:rPr>
+      </w:pPr>
+    </w:p>
+    <w:p>
+      <w:pPr>
+        <w:rPr>
+          <w:rFonts w:ascii="Arial" w:hAnsi="Arial" w:cs="Arial"/>
+          <w:sz w:val="28"/>
+          <w:szCs w:val="28"/>
+        </w:rPr>
+      </w:pPr>
+    </w:p>
+    <w:p>
+      <w:pPr>
+        <w:rPr>
+          <w:rFonts w:ascii="Arial" w:hAnsi="Arial" w:cs="Arial"/>
+          <w:sz w:val="28"/>
+          <w:szCs w:val="28"/>
+        </w:rPr>
+      </w:pPr>
+    </w:p>
+    <w:p>
+      <w:pPr>
+        <w:rPr>
+          <w:rFonts w:ascii="Arial" w:hAnsi="Arial" w:cs="Arial"/>
+          <w:sz w:val="28"/>
+          <w:szCs w:val="28"/>
+        </w:rPr>
+      </w:pPr>
+    </w:p>
+    <w:p>
+      <w:pPr>
+        <w:rPr>
+          <w:rFonts w:ascii="Arial" w:hAnsi="Arial" w:cs="Arial"/>
+          <w:sz w:val="28"/>
+          <w:szCs w:val="28"/>
+        </w:rPr>
+      </w:pPr>
+    </w:p>
+    <w:p>
+      <w:pPr>
+        <w:rPr>
+          <w:rFonts w:ascii="Arial" w:hAnsi="Arial" w:cs="Arial"/>
+          <w:sz w:val="28"/>
+          <w:szCs w:val="28"/>
+        </w:rPr>
+      </w:pPr>
+    </w:p>
+    <w:p>
+      <w:pPr>
+        <w:rPr>
+          <w:rFonts w:ascii="Arial" w:hAnsi="Arial" w:cs="Arial"/>
+          <w:sz w:val="28"/>
+          <w:szCs w:val="28"/>
+        </w:rPr>
+      </w:pPr>
+    </w:p>
+    <w:p>
+      <w:pPr>
+        <w:rPr>
+          <w:rFonts w:ascii="Arial" w:hAnsi="Arial" w:cs="Arial"/>
+          <w:sz w:val="28"/>
+          <w:szCs w:val="28"/>
+        </w:rPr>
+      </w:pPr>
+    </w:p>
+    <w:p>
+      <w:pPr>
+        <w:rPr>
+          <w:rFonts w:ascii="Arial" w:hAnsi="Arial" w:cs="Arial"/>
+          <w:sz w:val="28"/>
+          <w:szCs w:val="28"/>
+        </w:rPr>
+      </w:pPr>
+      <w:r>
+        <w:rPr>
+          <w:rFonts w:ascii="Arial" w:hAnsi="Arial" w:cs="Arial"/>
+          <w:sz w:val="28"/>
+          <w:szCs w:val="28"/>
+        </w:rPr>
+        <w:lastRenderedPageBreak/>
+        <w:t>Misuse case diagram:</w:t>
+      </w:r>
+    </w:p>
+    <w:p>
+      <w:pPr>
+        <w:rPr>
+          <w:noProof/>
+        </w:rPr>
+      </w:pPr>
+      <w:r>
+        <w:rPr>
+          <w:noProof/>
+        </w:rPr>
+        <w:drawing>
+          <wp:inline distT="0" distB="0" distL="0" distR="0" wp14:anchorId="793AB0F2" wp14:editId="4315AF2A">
+            <wp:extent cx="5943600" cy="6390005"/>
+            <wp:effectExtent l="0" t="0" r="0" b="0"/>
+            <wp:docPr id="15" name="Picture 15"/>
+            <wp:cNvGraphicFramePr>
+              <a:graphicFrameLocks xmlns:a="http://schemas.openxmlformats.org/drawingml/2006/main" noChangeAspect="1"/>
+            </wp:cNvGraphicFramePr>
+            <a:graphic xmlns:a="http://schemas.openxmlformats.org/drawingml/2006/main">
+              <a:graphicData uri="http://schemas.openxmlformats.org/drawingml/2006/picture">
+                <pic:pic xmlns:pic="http://schemas.openxmlformats.org/drawingml/2006/picture">
+                  <pic:nvPicPr>
+                    <pic:cNvPr id="1" name=""/>
+                    <pic:cNvPicPr/>
+                  </pic:nvPicPr>
+                  <pic:blipFill>
+                    <a:blip r:embed="rId19"/>
+                    <a:stretch>
+                      <a:fillRect/>
+                    </a:stretch>
+                  </pic:blipFill>
+                  <pic:spPr>
+                    <a:xfrm>
+                      <a:off x="0" y="0"/>
+                      <a:ext cx="5943600" cy="6390005"/>
+                    </a:xfrm>
+                    <a:prstGeom prst="rect">
+                      <a:avLst/>
+                    </a:prstGeom>
+                  </pic:spPr>
+                </pic:pic>
+              </a:graphicData>
+            </a:graphic>
+          </wp:inline>
+        </w:drawing>
+      </w:r>
+      <w:r>
+        <w:rPr>
+          <w:rFonts w:ascii="Arial" w:hAnsi="Arial" w:cs="Arial"/>
+          <w:sz w:val="28"/>
+          <w:szCs w:val="28"/>
+        </w:rPr>
+        <w:br/>
+      </w:r>
+    </w:p>
+    <w:p>
+      <w:pPr>
+        <w:rPr>
+          <w:noProof/>
+        </w:rPr>
+      </w:pPr>
+    </w:p>
+    <w:p>
+      <w:pPr>
+        <w:rPr>
+          <w:noProof/>
+        </w:rPr>
+      </w:pPr>
+    </w:p>
+    <w:p>
+      <w:pPr>
+        <w:rPr>
+          <w:noProof/>
+        </w:rPr>
+      </w:pPr>
+    </w:p>
+    <w:p>
+      <w:pPr>
+        <w:rPr>
+          <w:rFonts w:ascii="Arial" w:hAnsi="Arial" w:cs="Arial"/>
+          <w:sz w:val="28"/>
+          <w:szCs w:val="28"/>
+        </w:rPr>
+      </w:pPr>
+    </w:p>
+    <w:p>
+      <w:pPr>
+        <w:rPr>
+          <w:rFonts w:ascii="Arial" w:hAnsi="Arial" w:cs="Arial"/>
+          <w:sz w:val="28"/>
+          <w:szCs w:val="28"/>
+        </w:rPr>
+      </w:pPr>
+      <w:bookmarkStart w:id="17" w:name="_GoBack"/>
+      <w:bookmarkEnd w:id="17"/>
+      <w:r>
+        <w:rPr>
+          <w:rFonts w:ascii="Arial" w:hAnsi="Arial" w:cs="Arial"/>
+          <w:sz w:val="28"/>
+          <w:szCs w:val="28"/>
+        </w:rPr>
+        <w:lastRenderedPageBreak/>
+        <w:t>Sitemap:</w:t>
+      </w:r>
+    </w:p>
+    <w:p>
+      <w:pPr>
+        <w:rPr>
+          <w:rFonts w:ascii="Arial" w:hAnsi="Arial" w:cs="Arial"/>
+          <w:sz w:val="28"/>
+          <w:szCs w:val="28"/>
+        </w:rPr>
+      </w:pPr>
+      <w:r>
+        <w:rPr>
+          <w:noProof/>
+        </w:rPr>
+        <w:drawing>
+          <wp:inline distT="0" distB="0" distL="0" distR="0" wp14:anchorId="005F8E85" wp14:editId="6FB3B533">
+            <wp:extent cx="5943600" cy="5065395"/>
+            <wp:effectExtent l="0" t="0" r="0" b="1905"/>
+            <wp:docPr id="14" name="Picture 14"/>
+            <wp:cNvGraphicFramePr>
+              <a:graphicFrameLocks xmlns:a="http://schemas.openxmlformats.org/drawingml/2006/main" noChangeAspect="1"/>
+            </wp:cNvGraphicFramePr>
+            <a:graphic xmlns:a="http://schemas.openxmlformats.org/drawingml/2006/main">
+              <a:graphicData uri="http://schemas.openxmlformats.org/drawingml/2006/picture">
+                <pic:pic xmlns:pic="http://schemas.openxmlformats.org/drawingml/2006/picture">
+                  <pic:nvPicPr>
+                    <pic:cNvPr id="1" name=""/>
+                    <pic:cNvPicPr/>
+                  </pic:nvPicPr>
+                  <pic:blipFill>
+                    <a:blip r:embed="rId20"/>
+                    <a:stretch>
+                      <a:fillRect/>
+                    </a:stretch>
+                  </pic:blipFill>
+                  <pic:spPr>
+                    <a:xfrm>
+                      <a:off x="0" y="0"/>
+                      <a:ext cx="5943600" cy="5065395"/>
+                    </a:xfrm>
+                    <a:prstGeom prst="rect">
+                      <a:avLst/>
+                    </a:prstGeom>
+                  </pic:spPr>
+                </pic:pic>
+              </a:graphicData>
+            </a:graphic>
+          </wp:inline>
+        </w:drawing>
+      </w:r>
+    </w:p>
+    <w:p>
+      <w:pPr>
         <w:pStyle w:val="Heading1"/>
         <w:rPr>
           <w:rFonts w:ascii="Times New Roman" w:eastAsia="Times New Roman" w:hAnsi="Times New Roman" w:cs="Times New Roman"/>
           <w:color w:val="auto"/>
         </w:rPr>
       </w:pPr>
-      <w:bookmarkStart w:id="10" w:name="_Toc195383799"/>
-      <w:r>
+    </w:p>
+    <w:p/>
+    <w:p/>
+    <w:p/>
+    <w:p/>
+    <w:p/>
+    <w:p/>
+    <w:p/>
+    <w:p>
+      <w:pPr>
+        <w:pStyle w:val="Heading1"/>
         <w:rPr>
           <w:rFonts w:ascii="Times New Roman" w:eastAsia="Times New Roman" w:hAnsi="Times New Roman" w:cs="Times New Roman"/>
           <w:color w:val="auto"/>
         </w:rPr>
-        <w:t>Manual Testing:</w:t>
-      </w:r>
-      <w:bookmarkEnd w:id="10"/>
-    </w:p>
-    <w:p>
-      <w:pPr>
-        <w:pStyle w:val="Heading1"/>
+      </w:pPr>
+      <w:bookmarkStart w:id="18" w:name="_Toc197130520"/>
+      <w:r>
         <w:rPr>
           <w:rFonts w:ascii="Times New Roman" w:eastAsia="Times New Roman" w:hAnsi="Times New Roman" w:cs="Times New Roman"/>
           <w:color w:val="auto"/>
         </w:rPr>
-      </w:pPr>
-      <w:bookmarkStart w:id="11" w:name="_Toc195383800"/>
-      <w:r>
+        <w:lastRenderedPageBreak/>
+        <w:t>Manual Testing:</w:t>
+      </w:r>
+      <w:bookmarkEnd w:id="18"/>
+    </w:p>
+    <w:p/>
+    <w:p>
+      <w:pPr>
+        <w:pStyle w:val="Heading2"/>
+        <w:rPr>
+          <w:color w:val="000000" w:themeColor="text1"/>
+        </w:rPr>
+      </w:pPr>
+      <w:bookmarkStart w:id="19" w:name="_Toc197130521"/>
+      <w:r>
+        <w:rPr>
+          <w:color w:val="000000" w:themeColor="text1"/>
+        </w:rPr>
+        <w:t>Sign up Testing:</w:t>
+      </w:r>
+      <w:bookmarkEnd w:id="19"/>
+    </w:p>
+    <w:p/>
+    <w:p>
+      <w:r>
+        <w:rPr>
+          <w:noProof/>
+        </w:rPr>
+        <w:drawing>
+          <wp:inline distT="0" distB="0" distL="0" distR="0" wp14:anchorId="198A0728" wp14:editId="3844FFB4">
+            <wp:extent cx="6589209" cy="1257300"/>
+            <wp:effectExtent l="0" t="0" r="2540" b="0"/>
+            <wp:docPr id="9" name="Picture 9"/>
+            <wp:cNvGraphicFramePr>
+              <a:graphicFrameLocks xmlns:a="http://schemas.openxmlformats.org/drawingml/2006/main" noChangeAspect="1"/>
+            </wp:cNvGraphicFramePr>
+            <a:graphic xmlns:a="http://schemas.openxmlformats.org/drawingml/2006/main">
+              <a:graphicData uri="http://schemas.openxmlformats.org/drawingml/2006/picture">
+                <pic:pic xmlns:pic="http://schemas.openxmlformats.org/drawingml/2006/picture">
+                  <pic:nvPicPr>
+                    <pic:cNvPr id="1" name=""/>
+                    <pic:cNvPicPr/>
+                  </pic:nvPicPr>
+                  <pic:blipFill>
+                    <a:blip r:embed="rId21"/>
+                    <a:stretch>
+                      <a:fillRect/>
+                    </a:stretch>
+                  </pic:blipFill>
+                  <pic:spPr>
+                    <a:xfrm>
+                      <a:off x="0" y="0"/>
+                      <a:ext cx="6615225" cy="1262264"/>
+                    </a:xfrm>
+                    <a:prstGeom prst="rect">
+                      <a:avLst/>
+                    </a:prstGeom>
+                  </pic:spPr>
+                </pic:pic>
+              </a:graphicData>
+            </a:graphic>
+          </wp:inline>
+        </w:drawing>
+      </w:r>
+    </w:p>
+    <w:p>
+      <w:pPr>
+        <w:rPr>
+          <w:rStyle w:val="Heading2Char"/>
+          <w:color w:val="000000" w:themeColor="text1"/>
+        </w:rPr>
+      </w:pPr>
+      <w:bookmarkStart w:id="20" w:name="_Toc197130522"/>
+      <w:r>
+        <w:rPr>
+          <w:rStyle w:val="Heading2Char"/>
+          <w:color w:val="000000" w:themeColor="text1"/>
+        </w:rPr>
+        <w:t>Login Testing:</w:t>
+      </w:r>
+      <w:bookmarkEnd w:id="20"/>
+    </w:p>
+    <w:p>
+      <w:r>
+        <w:br/>
+      </w:r>
+      <w:r>
+        <w:rPr>
+          <w:noProof/>
+        </w:rPr>
+        <w:drawing>
+          <wp:inline distT="0" distB="0" distL="0" distR="0" wp14:anchorId="163ECB93" wp14:editId="2E25910D">
+            <wp:extent cx="5943600" cy="1031875"/>
+            <wp:effectExtent l="0" t="0" r="0" b="0"/>
+            <wp:docPr id="10" name="Picture 10"/>
+            <wp:cNvGraphicFramePr>
+              <a:graphicFrameLocks xmlns:a="http://schemas.openxmlformats.org/drawingml/2006/main" noChangeAspect="1"/>
+            </wp:cNvGraphicFramePr>
+            <a:graphic xmlns:a="http://schemas.openxmlformats.org/drawingml/2006/main">
+              <a:graphicData uri="http://schemas.openxmlformats.org/drawingml/2006/picture">
+                <pic:pic xmlns:pic="http://schemas.openxmlformats.org/drawingml/2006/picture">
+                  <pic:nvPicPr>
+                    <pic:cNvPr id="1" name=""/>
+                    <pic:cNvPicPr/>
+                  </pic:nvPicPr>
+                  <pic:blipFill>
+                    <a:blip r:embed="rId22"/>
+                    <a:stretch>
+                      <a:fillRect/>
+                    </a:stretch>
+                  </pic:blipFill>
+                  <pic:spPr>
+                    <a:xfrm>
+                      <a:off x="0" y="0"/>
+                      <a:ext cx="5943600" cy="1031875"/>
+                    </a:xfrm>
+                    <a:prstGeom prst="rect">
+                      <a:avLst/>
+                    </a:prstGeom>
+                  </pic:spPr>
+                </pic:pic>
+              </a:graphicData>
+            </a:graphic>
+          </wp:inline>
+        </w:drawing>
+      </w:r>
+    </w:p>
+    <w:p/>
+    <w:p>
+      <w:bookmarkStart w:id="21" w:name="_Toc197130523"/>
+      <w:r>
+        <w:rPr>
+          <w:rStyle w:val="Heading2Char"/>
+          <w:color w:val="000000" w:themeColor="text1"/>
+        </w:rPr>
+        <w:t>Forget password Testing:</w:t>
+      </w:r>
+      <w:bookmarkEnd w:id="21"/>
+    </w:p>
+    <w:p>
+      <w:r>
+        <w:br/>
+      </w:r>
+      <w:r>
+        <w:rPr>
+          <w:noProof/>
+        </w:rPr>
+        <w:drawing>
+          <wp:inline distT="0" distB="0" distL="0" distR="0" wp14:anchorId="0699AD35" wp14:editId="74E2E160">
+            <wp:extent cx="5943600" cy="1759585"/>
+            <wp:effectExtent l="0" t="0" r="0" b="0"/>
+            <wp:docPr id="11" name="Picture 11"/>
+            <wp:cNvGraphicFramePr>
+              <a:graphicFrameLocks xmlns:a="http://schemas.openxmlformats.org/drawingml/2006/main" noChangeAspect="1"/>
+            </wp:cNvGraphicFramePr>
+            <a:graphic xmlns:a="http://schemas.openxmlformats.org/drawingml/2006/main">
+              <a:graphicData uri="http://schemas.openxmlformats.org/drawingml/2006/picture">
+                <pic:pic xmlns:pic="http://schemas.openxmlformats.org/drawingml/2006/picture">
+                  <pic:nvPicPr>
+                    <pic:cNvPr id="1" name=""/>
+                    <pic:cNvPicPr/>
+                  </pic:nvPicPr>
+                  <pic:blipFill>
+                    <a:blip r:embed="rId23"/>
+                    <a:stretch>
+                      <a:fillRect/>
+                    </a:stretch>
+                  </pic:blipFill>
+                  <pic:spPr>
+                    <a:xfrm>
+                      <a:off x="0" y="0"/>
+                      <a:ext cx="5943600" cy="1759585"/>
+                    </a:xfrm>
+                    <a:prstGeom prst="rect">
+                      <a:avLst/>
+                    </a:prstGeom>
+                  </pic:spPr>
+                </pic:pic>
+              </a:graphicData>
+            </a:graphic>
+          </wp:inline>
+        </w:drawing>
+      </w:r>
+    </w:p>
+    <w:p>
+      <w:pPr>
+        <w:pStyle w:val="Heading1"/>
         <w:rPr>
           <w:rFonts w:ascii="Times New Roman" w:eastAsia="Times New Roman" w:hAnsi="Times New Roman" w:cs="Times New Roman"/>
           <w:color w:val="auto"/>
         </w:rPr>
-        <w:t>Automation Testing:</w:t>
-      </w:r>
-      <w:bookmarkEnd w:id="11"/>
-    </w:p>
-    <w:p>
-      <w:pPr>
-        <w:pStyle w:val="Heading1"/>
-        <w:rPr>
-          <w:rFonts w:ascii="Times New Roman" w:hAnsi="Times New Roman" w:cs="Times New Roman"/>
-          <w:color w:val="auto"/>
-        </w:rPr>
-      </w:pPr>
-      <w:bookmarkStart w:id="12" w:name="_Toc195383801"/>
-      <w:r>
-        <w:rPr>
-          <w:rFonts w:ascii="Times New Roman" w:hAnsi="Times New Roman" w:cs="Times New Roman"/>
-          <w:color w:val="auto"/>
-        </w:rPr>
-        <w:t>Risk Management:</w:t>
-      </w:r>
-      <w:bookmarkEnd w:id="12"/>
-    </w:p>
+      </w:pPr>
+    </w:p>
+    <w:p/>
+    <w:p/>
+    <w:p/>
     <w:p>
       <w:pPr>
         <w:pStyle w:val="Heading1"/>
@@ -4251,20 +5300,168 @@
           <w:color w:val="auto"/>
         </w:rPr>
       </w:pPr>
-      <w:bookmarkStart w:id="13" w:name="_Toc195383802"/>
+      <w:bookmarkStart w:id="22" w:name="_Toc197130524"/>
       <w:r>
         <w:rPr>
           <w:rFonts w:ascii="Times New Roman" w:eastAsia="Times New Roman" w:hAnsi="Times New Roman" w:cs="Times New Roman"/>
           <w:color w:val="auto"/>
         </w:rPr>
-        <w:t>GitHub Link:</w:t>
-      </w:r>
-      <w:bookmarkEnd w:id="13"/>
-      <w:r>
+        <w:lastRenderedPageBreak/>
+        <w:t>Automation Testing:</w:t>
+      </w:r>
+      <w:bookmarkEnd w:id="22"/>
+    </w:p>
+    <w:p/>
+    <w:p>
+      <w:r>
+        <w:t>This a script code that opens application and lo</w:t>
+      </w:r>
+      <w:r>
+        <w:t>gs in and create</w:t>
+      </w:r>
+      <w:r>
+        <w:t>s a t</w:t>
+      </w:r>
+      <w:r>
+        <w:t xml:space="preserve">ask </w:t>
+      </w:r>
+      <w:r>
+        <w:t>automatic</w:t>
+      </w:r>
+      <w:r>
+        <w:t>ally:</w:t>
+      </w:r>
+      <w:r>
+        <w:br/>
+      </w:r>
+      <w:r>
+        <w:rPr>
+          <w:noProof/>
+        </w:rPr>
+        <w:drawing>
+          <wp:inline distT="0" distB="0" distL="0" distR="0" wp14:anchorId="25A6D03F" wp14:editId="0B8FD6C2">
+            <wp:extent cx="5019675" cy="6810375"/>
+            <wp:effectExtent l="0" t="0" r="9525" b="9525"/>
+            <wp:docPr id="12" name="Picture 12"/>
+            <wp:cNvGraphicFramePr>
+              <a:graphicFrameLocks xmlns:a="http://schemas.openxmlformats.org/drawingml/2006/main" noChangeAspect="1"/>
+            </wp:cNvGraphicFramePr>
+            <a:graphic xmlns:a="http://schemas.openxmlformats.org/drawingml/2006/main">
+              <a:graphicData uri="http://schemas.openxmlformats.org/drawingml/2006/picture">
+                <pic:pic xmlns:pic="http://schemas.openxmlformats.org/drawingml/2006/picture">
+                  <pic:nvPicPr>
+                    <pic:cNvPr id="1" name=""/>
+                    <pic:cNvPicPr/>
+                  </pic:nvPicPr>
+                  <pic:blipFill>
+                    <a:blip r:embed="rId24"/>
+                    <a:stretch>
+                      <a:fillRect/>
+                    </a:stretch>
+                  </pic:blipFill>
+                  <pic:spPr>
+                    <a:xfrm>
+                      <a:off x="0" y="0"/>
+                      <a:ext cx="5019675" cy="6810375"/>
+                    </a:xfrm>
+                    <a:prstGeom prst="rect">
+                      <a:avLst/>
+                    </a:prstGeom>
+                  </pic:spPr>
+                </pic:pic>
+              </a:graphicData>
+            </a:graphic>
+          </wp:inline>
+        </w:drawing>
+      </w:r>
+    </w:p>
+    <w:p>
+      <w:pPr>
+        <w:pStyle w:val="Heading1"/>
+        <w:rPr>
+          <w:rFonts w:ascii="Times New Roman" w:hAnsi="Times New Roman" w:cs="Times New Roman"/>
+          <w:color w:val="auto"/>
+        </w:rPr>
+      </w:pPr>
+      <w:bookmarkStart w:id="23" w:name="_Toc197130525"/>
+      <w:r>
+        <w:rPr>
+          <w:rFonts w:ascii="Times New Roman" w:hAnsi="Times New Roman" w:cs="Times New Roman"/>
+          <w:color w:val="auto"/>
+        </w:rPr>
+        <w:lastRenderedPageBreak/>
+        <w:t>Risk Management:</w:t>
+      </w:r>
+      <w:bookmarkEnd w:id="23"/>
+    </w:p>
+    <w:p>
+      <w:pPr>
+        <w:pStyle w:val="Heading1"/>
         <w:rPr>
           <w:rFonts w:ascii="Times New Roman" w:eastAsia="Times New Roman" w:hAnsi="Times New Roman" w:cs="Times New Roman"/>
           <w:color w:val="auto"/>
         </w:rPr>
+      </w:pPr>
+    </w:p>
+    <w:p/>
+    <w:p/>
+    <w:p/>
+    <w:p/>
+    <w:p/>
+    <w:p/>
+    <w:p/>
+    <w:p/>
+    <w:p/>
+    <w:p/>
+    <w:p/>
+    <w:p/>
+    <w:p/>
+    <w:p/>
+    <w:p/>
+    <w:p/>
+    <w:p/>
+    <w:p/>
+    <w:p/>
+    <w:p/>
+    <w:p/>
+    <w:p/>
+    <w:p/>
+    <w:p>
+      <w:pPr>
+        <w:pStyle w:val="Heading1"/>
+        <w:rPr>
+          <w:rFonts w:asciiTheme="minorHAnsi" w:eastAsiaTheme="minorHAnsi" w:hAnsiTheme="minorHAnsi" w:cstheme="minorBidi"/>
+          <w:color w:val="auto"/>
+          <w:sz w:val="22"/>
+          <w:szCs w:val="22"/>
+        </w:rPr>
+      </w:pPr>
+      <w:bookmarkStart w:id="24" w:name="_Toc197130526"/>
+    </w:p>
+    <w:p/>
+    <w:p/>
+    <w:p>
+      <w:pPr>
+        <w:pStyle w:val="Heading1"/>
+        <w:rPr>
+          <w:rFonts w:ascii="Times New Roman" w:eastAsia="Times New Roman" w:hAnsi="Times New Roman" w:cs="Times New Roman"/>
+          <w:color w:val="auto"/>
+        </w:rPr>
+      </w:pPr>
+      <w:r>
+        <w:rPr>
+          <w:rFonts w:ascii="Times New Roman" w:eastAsia="Times New Roman" w:hAnsi="Times New Roman" w:cs="Times New Roman"/>
+          <w:color w:val="auto"/>
+        </w:rPr>
+        <w:lastRenderedPageBreak/>
+        <w:t>GitHub Link:</w:t>
+      </w:r>
+      <w:bookmarkEnd w:id="24"/>
+      <w:r>
+        <w:rPr>
+          <w:rFonts w:ascii="Times New Roman" w:eastAsia="Times New Roman" w:hAnsi="Times New Roman" w:cs="Times New Roman"/>
+          <w:color w:val="auto"/>
+        </w:rPr>
         <w:t xml:space="preserve"> </w:t>
       </w:r>
     </w:p>
@@ -4307,16 +5504,7 @@
           <w:sz w:val="28"/>
           <w:szCs w:val="28"/>
         </w:rPr>
-        <w:t xml:space="preserve"> contribution to the master </w:t>
-      </w:r>
-      <w:r>
-        <w:rPr>
-          <w:rFonts w:ascii="Times New Roman" w:hAnsi="Times New Roman" w:cs="Times New Roman"/>
-          <w:sz w:val="28"/>
-          <w:szCs w:val="28"/>
-        </w:rPr>
-        <w:lastRenderedPageBreak/>
-        <w:t>branch which is the main branch that gathers all individual branches into one complete branch/project</w:t>
+        <w:t xml:space="preserve"> contribution to the master branch which is the main branch that gathers all individual branches into one complete branch/project</w:t>
       </w:r>
     </w:p>
     <w:p>
@@ -4335,7 +5523,7 @@
         </w:rPr>
         <w:t xml:space="preserve">GitHub: </w:t>
       </w:r>
-      <w:hyperlink r:id="rId18" w:history="1">
+      <w:hyperlink r:id="rId25" w:history="1">
         <w:r>
           <w:rPr>
             <w:rStyle w:val="Hyperlink"/>
@@ -4343,8 +5531,105 @@
             <w:sz w:val="28"/>
             <w:szCs w:val="28"/>
           </w:rPr>
-          <w:t>https://github.com/Cookieking</w:t>
+          <w:t>https://github.com/Cookieking2490/List-to-go\</w:t>
         </w:r>
+      </w:hyperlink>
+    </w:p>
+    <w:p>
+      <w:pPr>
+        <w:pStyle w:val="Heading1"/>
+        <w:rPr>
+          <w:rFonts w:ascii="Times New Roman" w:hAnsi="Times New Roman" w:cs="Times New Roman"/>
+          <w:color w:val="auto"/>
+        </w:rPr>
+      </w:pPr>
+    </w:p>
+    <w:p>
+      <w:pPr>
+        <w:pStyle w:val="Heading1"/>
+        <w:rPr>
+          <w:rFonts w:ascii="Times New Roman" w:hAnsi="Times New Roman" w:cs="Times New Roman"/>
+          <w:color w:val="auto"/>
+        </w:rPr>
+      </w:pPr>
+      <w:bookmarkStart w:id="25" w:name="_Toc197130527"/>
+      <w:r>
+        <w:rPr>
+          <w:rFonts w:ascii="Times New Roman" w:hAnsi="Times New Roman" w:cs="Times New Roman"/>
+          <w:color w:val="auto"/>
+        </w:rPr>
+        <w:t>Link to Trello:</w:t>
+      </w:r>
+      <w:bookmarkEnd w:id="25"/>
+    </w:p>
+    <w:p/>
+    <w:p>
+      <w:pPr>
+        <w:rPr>
+          <w:rFonts w:ascii="Times New Roman" w:hAnsi="Times New Roman" w:cs="Times New Roman"/>
+          <w:sz w:val="28"/>
+          <w:szCs w:val="28"/>
+        </w:rPr>
+      </w:pPr>
+      <w:r>
+        <w:rPr>
+          <w:rFonts w:ascii="Times New Roman" w:hAnsi="Times New Roman" w:cs="Times New Roman"/>
+          <w:sz w:val="28"/>
+          <w:szCs w:val="28"/>
+        </w:rPr>
+        <w:t xml:space="preserve">When accessing our Trello dashboard, you are met </w:t>
+      </w:r>
+      <w:r>
+        <w:rPr>
+          <w:rFonts w:ascii="Times New Roman" w:hAnsi="Times New Roman" w:cs="Times New Roman"/>
+          <w:sz w:val="28"/>
+          <w:szCs w:val="28"/>
+        </w:rPr>
+        <w:t xml:space="preserve">with </w:t>
+      </w:r>
+      <w:r>
+        <w:rPr>
+          <w:rFonts w:ascii="Times New Roman" w:hAnsi="Times New Roman" w:cs="Times New Roman"/>
+          <w:sz w:val="28"/>
+          <w:szCs w:val="28"/>
+        </w:rPr>
+        <w:t>a bord that displays each detail of how our project was created and innovated over time through meetings, sprints, and coordination. Archives showcases all the things that have been completed. If we are in a current sprint, then we save anything completed to the done tab and anything in progress in the progress  tab . a fully immersive cycle to ensure a complete and successful project</w:t>
+      </w:r>
+    </w:p>
+    <w:p>
+      <w:pPr>
+        <w:spacing w:after="0" w:line="240" w:lineRule="auto"/>
+        <w:rPr>
+          <w:rFonts w:ascii="Times New Roman" w:hAnsi="Times New Roman" w:cs="Times New Roman"/>
+          <w:sz w:val="28"/>
+          <w:szCs w:val="28"/>
+        </w:rPr>
+      </w:pPr>
+      <w:r>
+        <w:rPr>
+          <w:rFonts w:ascii="Times New Roman" w:eastAsia="Times New Roman" w:hAnsi="Times New Roman" w:cs="Times New Roman"/>
+          <w:sz w:val="24"/>
+          <w:szCs w:val="24"/>
+        </w:rPr>
+        <w:t>T</w:t>
+      </w:r>
+      <w:r>
+        <w:rPr>
+          <w:rFonts w:ascii="Times New Roman" w:hAnsi="Times New Roman" w:cs="Times New Roman"/>
+          <w:sz w:val="28"/>
+          <w:szCs w:val="28"/>
+        </w:rPr>
+        <w:t>rello:</w:t>
+      </w:r>
+      <w:r>
+        <w:rPr>
+          <w:rFonts w:ascii="Times New Roman" w:hAnsi="Times New Roman" w:cs="Times New Roman"/>
+          <w:sz w:val="28"/>
+          <w:szCs w:val="28"/>
+        </w:rPr>
+        <w:t xml:space="preserve"> </w:t>
+      </w:r>
+      <w:hyperlink r:id="rId26" w:history="1">
         <w:r>
           <w:rPr>
             <w:rStyle w:val="Hyperlink"/>
@@ -4352,81 +5637,12 @@
             <w:sz w:val="28"/>
             <w:szCs w:val="28"/>
           </w:rPr>
-          <w:t>2</w:t>
-        </w:r>
-        <w:r>
-          <w:rPr>
-            <w:rStyle w:val="Hyperlink"/>
-            <w:rFonts w:ascii="Times New Roman" w:hAnsi="Times New Roman" w:cs="Times New Roman"/>
-            <w:sz w:val="28"/>
-            <w:szCs w:val="28"/>
-          </w:rPr>
-          <w:t>490/List-to-go</w:t>
-        </w:r>
-        <w:r>
-          <w:rPr>
-            <w:rStyle w:val="Hyperlink"/>
-            <w:rFonts w:ascii="Times New Roman" w:hAnsi="Times New Roman" w:cs="Times New Roman"/>
-            <w:sz w:val="28"/>
-            <w:szCs w:val="28"/>
-          </w:rPr>
-          <w:t>\</w:t>
+          <w:t>https://trello.com/b/Qm214vVA/flaming-hot-cheetos</w:t>
         </w:r>
       </w:hyperlink>
     </w:p>
     <w:p>
       <w:pPr>
-        <w:pStyle w:val="Heading1"/>
-        <w:rPr>
-          <w:rFonts w:ascii="Times New Roman" w:hAnsi="Times New Roman" w:cs="Times New Roman"/>
-          <w:color w:val="auto"/>
-        </w:rPr>
-      </w:pPr>
-      <w:bookmarkStart w:id="14" w:name="_Toc195383803"/>
-      <w:r>
-        <w:rPr>
-          <w:rFonts w:ascii="Times New Roman" w:hAnsi="Times New Roman" w:cs="Times New Roman"/>
-          <w:color w:val="auto"/>
-        </w:rPr>
-        <w:t>Link to Trello:</w:t>
-      </w:r>
-      <w:bookmarkEnd w:id="14"/>
-    </w:p>
-    <w:p>
-      <w:pPr>
-        <w:rPr>
-          <w:rFonts w:ascii="Times New Roman" w:hAnsi="Times New Roman" w:cs="Times New Roman"/>
-          <w:sz w:val="28"/>
-          <w:szCs w:val="28"/>
-        </w:rPr>
-      </w:pPr>
-      <w:r>
-        <w:rPr>
-          <w:rFonts w:ascii="Times New Roman" w:hAnsi="Times New Roman" w:cs="Times New Roman"/>
-          <w:sz w:val="28"/>
-          <w:szCs w:val="28"/>
-        </w:rPr>
-        <w:t xml:space="preserve">When accessing our Trello dashboard, you are met </w:t>
-      </w:r>
-      <w:r>
-        <w:rPr>
-          <w:rFonts w:ascii="Times New Roman" w:hAnsi="Times New Roman" w:cs="Times New Roman"/>
-          <w:sz w:val="28"/>
-          <w:szCs w:val="28"/>
-        </w:rPr>
-        <w:t xml:space="preserve">with </w:t>
-      </w:r>
-      <w:r>
-        <w:rPr>
-          <w:rFonts w:ascii="Times New Roman" w:hAnsi="Times New Roman" w:cs="Times New Roman"/>
-          <w:sz w:val="28"/>
-          <w:szCs w:val="28"/>
-        </w:rPr>
-        <w:t>a bord that displays each detail of how our project was created and innovated over time through meetings, sprints, and coordination. Archives showcases all the things that have been completed. If we are in a current sprint, then we save anything completed to the done tab and anything in progress in the progress  tab . a fully immersive cycle to ensure a complete and successful project</w:t>
-      </w:r>
-    </w:p>
-    <w:p>
-      <w:pPr>
         <w:spacing w:after="0" w:line="240" w:lineRule="auto"/>
         <w:rPr>
           <w:rFonts w:ascii="Times New Roman" w:hAnsi="Times New Roman" w:cs="Times New Roman"/>
@@ -4434,38 +5650,6 @@
           <w:szCs w:val="28"/>
         </w:rPr>
       </w:pPr>
-      <w:r>
-        <w:rPr>
-          <w:rFonts w:ascii="Times New Roman" w:eastAsia="Times New Roman" w:hAnsi="Times New Roman" w:cs="Times New Roman"/>
-          <w:sz w:val="24"/>
-          <w:szCs w:val="24"/>
-        </w:rPr>
-        <w:t>T</w:t>
-      </w:r>
-      <w:r>
-        <w:rPr>
-          <w:rFonts w:ascii="Times New Roman" w:hAnsi="Times New Roman" w:cs="Times New Roman"/>
-          <w:sz w:val="28"/>
-          <w:szCs w:val="28"/>
-        </w:rPr>
-        <w:t xml:space="preserve">rello: </w:t>
-      </w:r>
-      <w:hyperlink r:id="rId19" w:history="1">
-        <w:r>
-          <w:rPr>
-            <w:sz w:val="28"/>
-            <w:szCs w:val="28"/>
-          </w:rPr>
-          <w:t>https://trello.com/b/Qm214vVA/flaming-hot-cheetos</w:t>
-        </w:r>
-        <w:r>
-          <w:rPr>
-            <w:sz w:val="28"/>
-            <w:szCs w:val="28"/>
-          </w:rPr>
-          <w:t>\</w:t>
-        </w:r>
-      </w:hyperlink>
     </w:p>
     <w:p>
       <w:pPr>
@@ -4537,7 +5721,7 @@
 </file>
 
 <file path=word/endnotes.xml><?xml version="1.0" encoding="utf-8"?>
-<w:endnotes xmlns:wpc="http://schemas.microsoft.com/office/word/2010/wordprocessingCanvas" xmlns:cx="http://schemas.microsoft.com/office/drawing/2014/chartex" xmlns:cx1="http://schemas.microsoft.com/office/drawing/2015/9/8/chartex" xmlns:cx2="http://schemas.microsoft.com/office/drawing/2015/10/21/chartex" xmlns:cx3="http://schemas.microsoft.com/office/drawing/2016/5/9/chartex" xmlns:cx4="http://schemas.microsoft.com/office/drawing/2016/5/10/chartex" xmlns:cx5="http://schemas.microsoft.com/office/drawing/2016/5/11/chartex" xmlns:cx6="http://schemas.microsoft.com/office/drawing/2016/5/12/chartex" xmlns:cx7="http://schemas.microsoft.com/office/drawing/2016/5/13/chartex" xmlns:cx8="http://schemas.microsoft.com/office/drawing/2016/5/14/chartex" xmlns:mc="http://schemas.openxmlformats.org/markup-compatibility/2006" xmlns:aink="http://schemas.microsoft.com/office/drawing/2016/ink" xmlns:am3d="http://schemas.microsoft.com/office/drawing/2017/model3d" xmlns:o="urn:schemas-microsoft-com:office:office" xmlns:oel="http://schemas.microsoft.com/office/2019/extlst" xmlns:r="http://schemas.openxmlformats.org/officeDocument/2006/relationships" xmlns:m="http://schemas.openxmlformats.org/officeDocument/2006/math" xmlns:v="urn:schemas-microsoft-com:vml" xmlns:wp14="http://schemas.microsoft.com/office/word/2010/wordprocessingDrawing" xmlns:wp="http://schemas.openxmlformats.org/drawingml/2006/wordprocessingDrawing" xmlns:w10="urn:schemas-microsoft-com:office:word" xmlns:w="http://schemas.openxmlformats.org/wordprocessingml/2006/main" xmlns:w14="http://schemas.microsoft.com/office/word/2010/wordml" xmlns:w15="http://schemas.microsoft.com/office/word/2012/wordml" xmlns:w16cex="http://schemas.microsoft.com/office/word/2018/wordml/cex" xmlns:w16cid="http://schemas.microsoft.com/office/word/2016/wordml/cid" xmlns:w16="http://schemas.microsoft.com/office/word/2018/wordml" xmlns:w16du="http://schemas.microsoft.com/office/word/2023/wordml/word16du" xmlns:w16sdtdh="http://schemas.microsoft.com/office/word/2020/wordml/sdtdatahash" xmlns:w16sdtfl="http://schemas.microsoft.com/office/word/2024/wordml/sdtformatlock" xmlns:w16se="http://schemas.microsoft.com/office/word/2015/wordml/symex" xmlns:wpg="http://schemas.microsoft.com/office/word/2010/wordprocessingGroup" xmlns:wpi="http://schemas.microsoft.com/office/word/2010/wordprocessingInk" xmlns:wne="http://schemas.microsoft.com/office/word/2006/wordml" xmlns:wps="http://schemas.microsoft.com/office/word/2010/wordprocessingShape" mc:Ignorable="w14 w15 w16se w16cid w16 w16cex w16sdtdh w16sdtfl w16du wp14">
+<w:endnotes xmlns:wpc="http://schemas.microsoft.com/office/word/2010/wordprocessingCanvas" xmlns:mc="http://schemas.openxmlformats.org/markup-compatibility/2006" xmlns:o="urn:schemas-microsoft-com:office:office" xmlns:r="http://schemas.openxmlformats.org/officeDocument/2006/relationships" xmlns:m="http://schemas.openxmlformats.org/officeDocument/2006/math" xmlns:v="urn:schemas-microsoft-com:vml" xmlns:wp14="http://schemas.microsoft.com/office/word/2010/wordprocessingDrawing" xmlns:wp="http://schemas.openxmlformats.org/drawingml/2006/wordprocessingDrawing" xmlns:w10="urn:schemas-microsoft-com:office:word" xmlns:w="http://schemas.openxmlformats.org/wordprocessingml/2006/main" xmlns:w14="http://schemas.microsoft.com/office/word/2010/wordml" xmlns:w15="http://schemas.microsoft.com/office/word/2012/wordml" xmlns:wpg="http://schemas.microsoft.com/office/word/2010/wordprocessingGroup" xmlns:wpi="http://schemas.microsoft.com/office/word/2010/wordprocessingInk" xmlns:wne="http://schemas.microsoft.com/office/word/2006/wordml" xmlns:wps="http://schemas.microsoft.com/office/word/2010/wordprocessingShape" mc:Ignorable="w14 w15 wp14">
   <w:endnote w:type="separator" w:id="-1">
     <w:p>
       <w:pPr>
@@ -4562,7 +5746,7 @@
 </file>
 
 <file path=word/footnotes.xml><?xml version="1.0" encoding="utf-8"?>
-<w:footnotes xmlns:wpc="http://schemas.microsoft.com/office/word/2010/wordprocessingCanvas" xmlns:cx="http://schemas.microsoft.com/office/drawing/2014/chartex" xmlns:cx1="http://schemas.microsoft.com/office/drawing/2015/9/8/chartex" xmlns:cx2="http://schemas.microsoft.com/office/drawing/2015/10/21/chartex" xmlns:cx3="http://schemas.microsoft.com/office/drawing/2016/5/9/chartex" xmlns:cx4="http://schemas.microsoft.com/office/drawing/2016/5/10/chartex" xmlns:cx5="http://schemas.microsoft.com/office/drawing/2016/5/11/chartex" xmlns:cx6="http://schemas.microsoft.com/office/drawing/2016/5/12/chartex" xmlns:cx7="http://schemas.microsoft.com/office/drawing/2016/5/13/chartex" xmlns:cx8="http://schemas.microsoft.com/office/drawing/2016/5/14/chartex" xmlns:mc="http://schemas.openxmlformats.org/markup-compatibility/2006" xmlns:aink="http://schemas.microsoft.com/office/drawing/2016/ink" xmlns:am3d="http://schemas.microsoft.com/office/drawing/2017/model3d" xmlns:o="urn:schemas-microsoft-com:office:office" xmlns:oel="http://schemas.microsoft.com/office/2019/extlst" xmlns:r="http://schemas.openxmlformats.org/officeDocument/2006/relationships" xmlns:m="http://schemas.openxmlformats.org/officeDocument/2006/math" xmlns:v="urn:schemas-microsoft-com:vml" xmlns:wp14="http://schemas.microsoft.com/office/word/2010/wordprocessingDrawing" xmlns:wp="http://schemas.openxmlformats.org/drawingml/2006/wordprocessingDrawing" xmlns:w10="urn:schemas-microsoft-com:office:word" xmlns:w="http://schemas.openxmlformats.org/wordprocessingml/2006/main" xmlns:w14="http://schemas.microsoft.com/office/word/2010/wordml" xmlns:w15="http://schemas.microsoft.com/office/word/2012/wordml" xmlns:w16cex="http://schemas.microsoft.com/office/word/2018/wordml/cex" xmlns:w16cid="http://schemas.microsoft.com/office/word/2016/wordml/cid" xmlns:w16="http://schemas.microsoft.com/office/word/2018/wordml" xmlns:w16du="http://schemas.microsoft.com/office/word/2023/wordml/word16du" xmlns:w16sdtdh="http://schemas.microsoft.com/office/word/2020/wordml/sdtdatahash" xmlns:w16sdtfl="http://schemas.microsoft.com/office/word/2024/wordml/sdtformatlock" xmlns:w16se="http://schemas.microsoft.com/office/word/2015/wordml/symex" xmlns:wpg="http://schemas.microsoft.com/office/word/2010/wordprocessingGroup" xmlns:wpi="http://schemas.microsoft.com/office/word/2010/wordprocessingInk" xmlns:wne="http://schemas.microsoft.com/office/word/2006/wordml" xmlns:wps="http://schemas.microsoft.com/office/word/2010/wordprocessingShape" mc:Ignorable="w14 w15 w16se w16cid w16 w16cex w16sdtdh w16sdtfl w16du wp14">
+<w:footnotes xmlns:wpc="http://schemas.microsoft.com/office/word/2010/wordprocessingCanvas" xmlns:mc="http://schemas.openxmlformats.org/markup-compatibility/2006" xmlns:o="urn:schemas-microsoft-com:office:office" xmlns:r="http://schemas.openxmlformats.org/officeDocument/2006/relationships" xmlns:m="http://schemas.openxmlformats.org/officeDocument/2006/math" xmlns:v="urn:schemas-microsoft-com:vml" xmlns:wp14="http://schemas.microsoft.com/office/word/2010/wordprocessingDrawing" xmlns:wp="http://schemas.openxmlformats.org/drawingml/2006/wordprocessingDrawing" xmlns:w10="urn:schemas-microsoft-com:office:word" xmlns:w="http://schemas.openxmlformats.org/wordprocessingml/2006/main" xmlns:w14="http://schemas.microsoft.com/office/word/2010/wordml" xmlns:w15="http://schemas.microsoft.com/office/word/2012/wordml" xmlns:wpg="http://schemas.microsoft.com/office/word/2010/wordprocessingGroup" xmlns:wpi="http://schemas.microsoft.com/office/word/2010/wordprocessingInk" xmlns:wne="http://schemas.microsoft.com/office/word/2006/wordml" xmlns:wps="http://schemas.microsoft.com/office/word/2010/wordprocessingShape" mc:Ignorable="w14 w15 wp14">
   <w:footnote w:type="separator" w:id="-1">
     <w:p>
       <w:pPr>
@@ -4587,7 +5771,7 @@
 </file>
 
 <file path=word/numbering.xml><?xml version="1.0" encoding="utf-8"?>
-<w:numbering xmlns:wpc="http://schemas.microsoft.com/office/word/2010/wordprocessingCanvas" xmlns:cx="http://schemas.microsoft.com/office/drawing/2014/chartex" xmlns:cx1="http://schemas.microsoft.com/office/drawing/2015/9/8/chartex" xmlns:cx2="http://schemas.microsoft.com/office/drawing/2015/10/21/chartex" xmlns:cx3="http://schemas.microsoft.com/office/drawing/2016/5/9/chartex" xmlns:cx4="http://schemas.microsoft.com/office/drawing/2016/5/10/chartex" xmlns:cx5="http://schemas.microsoft.com/office/drawing/2016/5/11/chartex" xmlns:cx6="http://schemas.microsoft.com/office/drawing/2016/5/12/chartex" xmlns:cx7="http://schemas.microsoft.com/office/drawing/2016/5/13/chartex" xmlns:cx8="http://schemas.microsoft.com/office/drawing/2016/5/14/chartex" xmlns:mc="http://schemas.openxmlformats.org/markup-compatibility/2006" xmlns:aink="http://schemas.microsoft.com/office/drawing/2016/ink" xmlns:am3d="http://schemas.microsoft.com/office/drawing/2017/model3d" xmlns:o="urn:schemas-microsoft-com:office:office" xmlns:oel="http://schemas.microsoft.com/office/2019/extlst" xmlns:r="http://schemas.openxmlformats.org/officeDocument/2006/relationships" xmlns:m="http://schemas.openxmlformats.org/officeDocument/2006/math" xmlns:v="urn:schemas-microsoft-com:vml" xmlns:wp14="http://schemas.microsoft.com/office/word/2010/wordprocessingDrawing" xmlns:wp="http://schemas.openxmlformats.org/drawingml/2006/wordprocessingDrawing" xmlns:w10="urn:schemas-microsoft-com:office:word" xmlns:w="http://schemas.openxmlformats.org/wordprocessingml/2006/main" xmlns:w14="http://schemas.microsoft.com/office/word/2010/wordml" xmlns:w15="http://schemas.microsoft.com/office/word/2012/wordml" xmlns:w16cex="http://schemas.microsoft.com/office/word/2018/wordml/cex" xmlns:w16cid="http://schemas.microsoft.com/office/word/2016/wordml/cid" xmlns:w16="http://schemas.microsoft.com/office/word/2018/wordml" xmlns:w16du="http://schemas.microsoft.com/office/word/2023/wordml/word16du" xmlns:w16sdtdh="http://schemas.microsoft.com/office/word/2020/wordml/sdtdatahash" xmlns:w16sdtfl="http://schemas.microsoft.com/office/word/2024/wordml/sdtformatlock" xmlns:w16se="http://schemas.microsoft.com/office/word/2015/wordml/symex" xmlns:wpg="http://schemas.microsoft.com/office/word/2010/wordprocessingGroup" xmlns:wpi="http://schemas.microsoft.com/office/word/2010/wordprocessingInk" xmlns:wne="http://schemas.microsoft.com/office/word/2006/wordml" xmlns:wps="http://schemas.microsoft.com/office/word/2010/wordprocessingShape" mc:Ignorable="w14 w15 w16se w16cid w16 w16cex w16sdtdh w16sdtfl w16du wp14">
+<w:numbering xmlns:wpc="http://schemas.microsoft.com/office/word/2010/wordprocessingCanvas" xmlns:mc="http://schemas.openxmlformats.org/markup-compatibility/2006" xmlns:o="urn:schemas-microsoft-com:office:office" xmlns:r="http://schemas.openxmlformats.org/officeDocument/2006/relationships" xmlns:m="http://schemas.openxmlformats.org/officeDocument/2006/math" xmlns:v="urn:schemas-microsoft-com:vml" xmlns:wp14="http://schemas.microsoft.com/office/word/2010/wordprocessingDrawing" xmlns:wp="http://schemas.openxmlformats.org/drawingml/2006/wordprocessingDrawing" xmlns:w10="urn:schemas-microsoft-com:office:word" xmlns:w="http://schemas.openxmlformats.org/wordprocessingml/2006/main" xmlns:w14="http://schemas.microsoft.com/office/word/2010/wordml" xmlns:w15="http://schemas.microsoft.com/office/word/2012/wordml" xmlns:wpg="http://schemas.microsoft.com/office/word/2010/wordprocessingGroup" xmlns:wpi="http://schemas.microsoft.com/office/word/2010/wordprocessingInk" xmlns:wne="http://schemas.microsoft.com/office/word/2006/wordml" xmlns:wps="http://schemas.microsoft.com/office/word/2010/wordprocessingShape" mc:Ignorable="w14 w15 wp14">
   <w:abstractNum w:abstractNumId="0" w15:restartNumberingAfterBreak="0">
     <w:nsid w:val="07087FF0"/>
     <w:multiLevelType w:val="hybridMultilevel"/>
@@ -4927,20 +6111,20 @@
       </w:rPr>
     </w:lvl>
   </w:abstractNum>
-  <w:num w:numId="1" w16cid:durableId="692918632">
+  <w:num w:numId="1">
     <w:abstractNumId w:val="2"/>
   </w:num>
-  <w:num w:numId="2" w16cid:durableId="229121982">
+  <w:num w:numId="2">
     <w:abstractNumId w:val="0"/>
   </w:num>
-  <w:num w:numId="3" w16cid:durableId="2051570692">
+  <w:num w:numId="3">
     <w:abstractNumId w:val="1"/>
   </w:num>
 </w:numbering>
 </file>
 
 <file path=word/styles.xml><?xml version="1.0" encoding="utf-8"?>
-<w:styles xmlns:mc="http://schemas.openxmlformats.org/markup-compatibility/2006" xmlns:r="http://schemas.openxmlformats.org/officeDocument/2006/relationships" xmlns:w="http://schemas.openxmlformats.org/wordprocessingml/2006/main" xmlns:w14="http://schemas.microsoft.com/office/word/2010/wordml" xmlns:w15="http://schemas.microsoft.com/office/word/2012/wordml" xmlns:w16cex="http://schemas.microsoft.com/office/word/2018/wordml/cex" xmlns:w16cid="http://schemas.microsoft.com/office/word/2016/wordml/cid" xmlns:w16="http://schemas.microsoft.com/office/word/2018/wordml" xmlns:w16du="http://schemas.microsoft.com/office/word/2023/wordml/word16du" xmlns:w16sdtdh="http://schemas.microsoft.com/office/word/2020/wordml/sdtdatahash" xmlns:w16sdtfl="http://schemas.microsoft.com/office/word/2024/wordml/sdtformatlock" xmlns:w16se="http://schemas.microsoft.com/office/word/2015/wordml/symex" mc:Ignorable="w14 w15 w16se w16cid w16 w16cex w16sdtdh w16sdtfl w16du">
+<w:styles xmlns:mc="http://schemas.openxmlformats.org/markup-compatibility/2006" xmlns:r="http://schemas.openxmlformats.org/officeDocument/2006/relationships" xmlns:w="http://schemas.openxmlformats.org/wordprocessingml/2006/main" xmlns:w14="http://schemas.microsoft.com/office/word/2010/wordml" xmlns:w15="http://schemas.microsoft.com/office/word/2012/wordml" mc:Ignorable="w14 w15">
   <w:docDefaults>
     <w:rPrDefault>
       <w:rPr>
@@ -4956,7 +6140,7 @@
       </w:pPr>
     </w:pPrDefault>
   </w:docDefaults>
-  <w:latentStyles w:defLockedState="0" w:defUIPriority="99" w:defSemiHidden="0" w:defUnhideWhenUsed="0" w:defQFormat="0" w:count="376">
+  <w:latentStyles w:defLockedState="0" w:defUIPriority="99" w:defSemiHidden="0" w:defUnhideWhenUsed="0" w:defQFormat="0" w:count="371">
     <w:lsdException w:name="Normal" w:uiPriority="0" w:qFormat="1"/>
     <w:lsdException w:name="heading 1" w:uiPriority="9" w:qFormat="1"/>
     <w:lsdException w:name="heading 2" w:semiHidden="1" w:uiPriority="9" w:unhideWhenUsed="1" w:qFormat="1"/>
@@ -5328,11 +6512,6 @@
     <w:lsdException w:name="List Table 5 Dark Accent 6" w:uiPriority="50"/>
     <w:lsdException w:name="List Table 6 Colorful Accent 6" w:uiPriority="51"/>
     <w:lsdException w:name="List Table 7 Colorful Accent 6" w:uiPriority="52"/>
-    <w:lsdException w:name="Mention" w:semiHidden="1" w:unhideWhenUsed="1"/>
-    <w:lsdException w:name="Smart Hyperlink" w:semiHidden="1" w:unhideWhenUsed="1"/>
-    <w:lsdException w:name="Hashtag" w:semiHidden="1" w:unhideWhenUsed="1"/>
-    <w:lsdException w:name="Unresolved Mention" w:semiHidden="1" w:unhideWhenUsed="1"/>
-    <w:lsdException w:name="Smart Link" w:semiHidden="1" w:unhideWhenUsed="1"/>
   </w:latentStyles>
   <w:style w:type="paragraph" w:default="1" w:styleId="Normal">
     <w:name w:val="Normal"/>
@@ -5537,7 +6716,7 @@
     <w:uiPriority w:val="99"/>
     <w:rsid w:val="00C82CE6"/>
   </w:style>
-  <w:style w:type="character" w:styleId="UnresolvedMention">
+  <w:style w:type="character" w:customStyle="1" w:styleId="UnresolvedMention">
     <w:name w:val="Unresolved Mention"/>
     <w:basedOn w:val="DefaultParagraphFont"/>
     <w:uiPriority w:val="99"/>
@@ -5818,7 +6997,7 @@
 </file>
 
 <file path=customXml/itemProps1.xml><?xml version="1.0" encoding="utf-8"?>
-<ds:datastoreItem xmlns:ds="http://schemas.openxmlformats.org/officeDocument/2006/customXml" ds:itemID="{C322A891-CA9A-4846-9291-D3E095573BA2}">
+<ds:datastoreItem xmlns:ds="http://schemas.openxmlformats.org/officeDocument/2006/customXml" ds:itemID="{C98E5124-745D-4D21-A2CF-B174E973CB47}">
   <ds:schemaRefs>
     <ds:schemaRef ds:uri="http://schemas.openxmlformats.org/officeDocument/2006/bibliography"/>
   </ds:schemaRefs>

</xml_diff>